<commit_message>
Dossier DEETS v2 : charte YEBA, titres MEM / Product Builder / RRH, calendrier mars 2027, note partenaires certificateurs
Co-Authored-By: Claude Opus 5.5 <noreply@anthropic.com>
Claude-Session: https://claude.ai/code/session_01XmXRuHREkUhS4BvVjcPE7t
</commit_message>
<xml_diff>
--- a/dossier-deets-apprentissage/word/04_Equipe_pedagogique_titres_et_qualites.docx
+++ b/dossier-deets-apprentissage/word/04_Equipe_pedagogique_titres_et_qualites.docx
@@ -8,27 +8,38 @@
       </w:pPr>
       <w:r>
         <w:rPr>
-          <w:rFonts w:ascii="Arial" w:cs="Arial" w:eastAsia="Arial" w:hAnsi="Arial"/>
+          <w:rFonts w:ascii="Montserrat" w:cs="Montserrat" w:eastAsia="Montserrat" w:hAnsi="Montserrat"/>
           <w:b/>
           <w:bCs/>
-          <w:color w:val="1F3A5F"/>
-          <w:sz w:val="36"/>
-          <w:szCs w:val="36"/>
-        </w:rPr>
-        <w:t xml:space="preserve">YEBA FORMATIONS</w:t>
+          <w:color w:val="1B3A6B"/>
+          <w:sz w:val="40"/>
+          <w:szCs w:val="40"/>
+        </w:rPr>
+        <w:t xml:space="preserve">YEBA</w:t>
+      </w:r>
+      <w:r>
+        <w:rPr>
+          <w:rFonts w:ascii="Montserrat" w:cs="Montserrat" w:eastAsia="Montserrat" w:hAnsi="Montserrat"/>
+          <w:b/>
+          <w:bCs/>
+          <w:color w:val="C9AB4C"/>
+          <w:sz w:val="40"/>
+          <w:szCs w:val="40"/>
+        </w:rPr>
+        <w:t xml:space="preserve">  FORMATIONS</w:t>
       </w:r>
     </w:p>
     <w:p>
       <w:pPr>
         <w:pBdr>
-          <w:bottom w:val="single" w:color="C8691C" w:sz="12" w:space="6"/>
+          <w:bottom w:val="single" w:color="C9AB4C" w:sz="12" w:space="6"/>
         </w:pBdr>
         <w:spacing w:after="240"/>
       </w:pPr>
       <w:r>
         <w:rPr>
-          <w:rFonts w:ascii="Arial" w:cs="Arial" w:eastAsia="Arial" w:hAnsi="Arial"/>
-          <w:color w:val="595959"/>
+          <w:rFonts w:ascii="Inter" w:cs="Inter" w:eastAsia="Inter" w:hAnsi="Inter"/>
+          <w:color w:val="4D4D4D"/>
           <w:sz w:val="20"/>
           <w:szCs w:val="20"/>
         </w:rPr>
@@ -41,10 +52,10 @@
       </w:pPr>
       <w:r>
         <w:rPr>
-          <w:rFonts w:ascii="Arial" w:cs="Arial" w:eastAsia="Arial" w:hAnsi="Arial"/>
+          <w:rFonts w:ascii="Montserrat" w:cs="Montserrat" w:eastAsia="Montserrat" w:hAnsi="Montserrat"/>
           <w:b/>
           <w:bCs/>
-          <w:color w:val="C8691C"/>
+          <w:color w:val="4D4D4D"/>
           <w:sz w:val="24"/>
           <w:szCs w:val="24"/>
         </w:rPr>
@@ -57,10 +68,10 @@
       </w:pPr>
       <w:r>
         <w:rPr>
-          <w:rFonts w:ascii="Arial" w:cs="Arial" w:eastAsia="Arial" w:hAnsi="Arial"/>
+          <w:rFonts w:ascii="Montserrat" w:cs="Montserrat" w:eastAsia="Montserrat" w:hAnsi="Montserrat"/>
           <w:b/>
           <w:bCs/>
-          <w:color w:val="1F3A5F"/>
+          <w:color w:val="1B3A6B"/>
           <w:sz w:val="32"/>
           <w:szCs w:val="32"/>
         </w:rPr>
@@ -91,21 +102,21 @@
         <w:tc>
           <w:tcPr>
             <w:tcW w:type="dxa" w:w="2600"/>
-            <w:shd w:fill="1F3A5F" w:color="auto" w:val="clear"/>
-            <w:tcMar>
-              <w:top w:type="dxa" w:w="60"/>
-              <w:left w:type="dxa" w:w="90"/>
-              <w:bottom w:type="dxa" w:w="60"/>
-              <w:right w:type="dxa" w:w="90"/>
-            </w:tcMar>
-          </w:tcPr>
-          <w:p>
-            <w:pPr>
-              <w:spacing w:after="40"/>
-            </w:pPr>
-            <w:r>
-              <w:rPr>
-                <w:rFonts w:ascii="Arial" w:cs="Arial" w:eastAsia="Arial" w:hAnsi="Arial"/>
+            <w:shd w:fill="1B3A6B" w:color="auto" w:val="clear"/>
+            <w:tcMar>
+              <w:top w:type="dxa" w:w="60"/>
+              <w:left w:type="dxa" w:w="90"/>
+              <w:bottom w:type="dxa" w:w="60"/>
+              <w:right w:type="dxa" w:w="90"/>
+            </w:tcMar>
+          </w:tcPr>
+          <w:p>
+            <w:pPr>
+              <w:spacing w:after="40"/>
+            </w:pPr>
+            <w:r>
+              <w:rPr>
+                <w:rFonts w:ascii="Inter" w:cs="Inter" w:eastAsia="Inter" w:hAnsi="Inter"/>
                 <w:b/>
                 <w:bCs/>
                 <w:color w:val="FFFFFF"/>
@@ -117,21 +128,21 @@
         <w:tc>
           <w:tcPr>
             <w:tcW w:type="dxa" w:w="7038"/>
-            <w:shd w:fill="1F3A5F" w:color="auto" w:val="clear"/>
-            <w:tcMar>
-              <w:top w:type="dxa" w:w="60"/>
-              <w:left w:type="dxa" w:w="90"/>
-              <w:bottom w:type="dxa" w:w="60"/>
-              <w:right w:type="dxa" w:w="90"/>
-            </w:tcMar>
-          </w:tcPr>
-          <w:p>
-            <w:pPr>
-              <w:spacing w:after="40"/>
-            </w:pPr>
-            <w:r>
-              <w:rPr>
-                <w:rFonts w:ascii="Arial" w:cs="Arial" w:eastAsia="Arial" w:hAnsi="Arial"/>
+            <w:shd w:fill="1B3A6B" w:color="auto" w:val="clear"/>
+            <w:tcMar>
+              <w:top w:type="dxa" w:w="60"/>
+              <w:left w:type="dxa" w:w="90"/>
+              <w:bottom w:type="dxa" w:w="60"/>
+              <w:right w:type="dxa" w:w="90"/>
+            </w:tcMar>
+          </w:tcPr>
+          <w:p>
+            <w:pPr>
+              <w:spacing w:after="40"/>
+            </w:pPr>
+            <w:r>
+              <w:rPr>
+                <w:rFonts w:ascii="Inter" w:cs="Inter" w:eastAsia="Inter" w:hAnsi="Inter"/>
                 <w:b/>
                 <w:bCs/>
                 <w:color w:val="FFFFFF"/>
@@ -161,7 +172,7 @@
             </w:pPr>
             <w:r>
               <w:rPr>
-                <w:rFonts w:ascii="Arial" w:cs="Arial" w:eastAsia="Arial" w:hAnsi="Arial"/>
+                <w:rFonts w:ascii="Inter" w:cs="Inter" w:eastAsia="Inter" w:hAnsi="Inter"/>
               </w:rPr>
               <w:t xml:space="preserve">Destinataire</w:t>
             </w:r>
@@ -183,7 +194,7 @@
             </w:pPr>
             <w:r>
               <w:rPr>
-                <w:rFonts w:ascii="Arial" w:cs="Arial" w:eastAsia="Arial" w:hAnsi="Arial"/>
+                <w:rFonts w:ascii="Inter" w:cs="Inter" w:eastAsia="Inter" w:hAnsi="Inter"/>
               </w:rPr>
               <w:t xml:space="preserve">DEETS La Réunion — Service de contrôle de la formation professionnelle</w:t>
             </w:r>
@@ -197,21 +208,21 @@
         <w:tc>
           <w:tcPr>
             <w:tcW w:type="dxa" w:w="2600"/>
-            <w:shd w:fill="EAF0F6" w:color="auto" w:val="clear"/>
-            <w:tcMar>
-              <w:top w:type="dxa" w:w="60"/>
-              <w:left w:type="dxa" w:w="90"/>
-              <w:bottom w:type="dxa" w:w="60"/>
-              <w:right w:type="dxa" w:w="90"/>
-            </w:tcMar>
-          </w:tcPr>
-          <w:p>
-            <w:pPr>
-              <w:spacing w:after="40"/>
-            </w:pPr>
-            <w:r>
-              <w:rPr>
-                <w:rFonts w:ascii="Arial" w:cs="Arial" w:eastAsia="Arial" w:hAnsi="Arial"/>
+            <w:shd w:fill="EEF1F6" w:color="auto" w:val="clear"/>
+            <w:tcMar>
+              <w:top w:type="dxa" w:w="60"/>
+              <w:left w:type="dxa" w:w="90"/>
+              <w:bottom w:type="dxa" w:w="60"/>
+              <w:right w:type="dxa" w:w="90"/>
+            </w:tcMar>
+          </w:tcPr>
+          <w:p>
+            <w:pPr>
+              <w:spacing w:after="40"/>
+            </w:pPr>
+            <w:r>
+              <w:rPr>
+                <w:rFonts w:ascii="Inter" w:cs="Inter" w:eastAsia="Inter" w:hAnsi="Inter"/>
               </w:rPr>
               <w:t xml:space="preserve">Référence</w:t>
             </w:r>
@@ -220,21 +231,21 @@
         <w:tc>
           <w:tcPr>
             <w:tcW w:type="dxa" w:w="7038"/>
-            <w:shd w:fill="EAF0F6" w:color="auto" w:val="clear"/>
-            <w:tcMar>
-              <w:top w:type="dxa" w:w="60"/>
-              <w:left w:type="dxa" w:w="90"/>
-              <w:bottom w:type="dxa" w:w="60"/>
-              <w:right w:type="dxa" w:w="90"/>
-            </w:tcMar>
-          </w:tcPr>
-          <w:p>
-            <w:pPr>
-              <w:spacing w:after="40"/>
-            </w:pPr>
-            <w:r>
-              <w:rPr>
-                <w:rFonts w:ascii="Arial" w:cs="Arial" w:eastAsia="Arial" w:hAnsi="Arial"/>
+            <w:shd w:fill="EEF1F6" w:color="auto" w:val="clear"/>
+            <w:tcMar>
+              <w:top w:type="dxa" w:w="60"/>
+              <w:left w:type="dxa" w:w="90"/>
+              <w:bottom w:type="dxa" w:w="60"/>
+              <w:right w:type="dxa" w:w="90"/>
+            </w:tcMar>
+          </w:tcPr>
+          <w:p>
+            <w:pPr>
+              <w:spacing w:after="40"/>
+            </w:pPr>
+            <w:r>
+              <w:rPr>
+                <w:rFonts w:ascii="Inter" w:cs="Inter" w:eastAsia="Inter" w:hAnsi="Inter"/>
               </w:rPr>
               <w:t xml:space="preserve">Courriel de la DEETS du 20 octobre 2026 — instruction au titre de l’article L.6351-5 du Code du travail</w:t>
             </w:r>
@@ -261,7 +272,7 @@
             </w:pPr>
             <w:r>
               <w:rPr>
-                <w:rFonts w:ascii="Arial" w:cs="Arial" w:eastAsia="Arial" w:hAnsi="Arial"/>
+                <w:rFonts w:ascii="Inter" w:cs="Inter" w:eastAsia="Inter" w:hAnsi="Inter"/>
               </w:rPr>
               <w:t xml:space="preserve">Objet de la pièce</w:t>
             </w:r>
@@ -283,7 +294,7 @@
             </w:pPr>
             <w:r>
               <w:rPr>
-                <w:rFonts w:ascii="Arial" w:cs="Arial" w:eastAsia="Arial" w:hAnsi="Arial"/>
+                <w:rFonts w:ascii="Inter" w:cs="Inter" w:eastAsia="Inter" w:hAnsi="Inter"/>
               </w:rPr>
               <w:t xml:space="preserve">Présentation des personnes intervenant en qualité de formateur ; les diplômes, certificats et CV sont joints en annexe.</w:t>
             </w:r>
@@ -297,21 +308,21 @@
         <w:tc>
           <w:tcPr>
             <w:tcW w:type="dxa" w:w="2600"/>
-            <w:shd w:fill="EAF0F6" w:color="auto" w:val="clear"/>
-            <w:tcMar>
-              <w:top w:type="dxa" w:w="60"/>
-              <w:left w:type="dxa" w:w="90"/>
-              <w:bottom w:type="dxa" w:w="60"/>
-              <w:right w:type="dxa" w:w="90"/>
-            </w:tcMar>
-          </w:tcPr>
-          <w:p>
-            <w:pPr>
-              <w:spacing w:after="40"/>
-            </w:pPr>
-            <w:r>
-              <w:rPr>
-                <w:rFonts w:ascii="Arial" w:cs="Arial" w:eastAsia="Arial" w:hAnsi="Arial"/>
+            <w:shd w:fill="EEF1F6" w:color="auto" w:val="clear"/>
+            <w:tcMar>
+              <w:top w:type="dxa" w:w="60"/>
+              <w:left w:type="dxa" w:w="90"/>
+              <w:bottom w:type="dxa" w:w="60"/>
+              <w:right w:type="dxa" w:w="90"/>
+            </w:tcMar>
+          </w:tcPr>
+          <w:p>
+            <w:pPr>
+              <w:spacing w:after="40"/>
+            </w:pPr>
+            <w:r>
+              <w:rPr>
+                <w:rFonts w:ascii="Inter" w:cs="Inter" w:eastAsia="Inter" w:hAnsi="Inter"/>
               </w:rPr>
               <w:t xml:space="preserve">Organisme</w:t>
             </w:r>
@@ -320,23 +331,23 @@
         <w:tc>
           <w:tcPr>
             <w:tcW w:type="dxa" w:w="7038"/>
-            <w:shd w:fill="EAF0F6" w:color="auto" w:val="clear"/>
-            <w:tcMar>
-              <w:top w:type="dxa" w:w="60"/>
-              <w:left w:type="dxa" w:w="90"/>
-              <w:bottom w:type="dxa" w:w="60"/>
-              <w:right w:type="dxa" w:w="90"/>
-            </w:tcMar>
-          </w:tcPr>
-          <w:p>
-            <w:pPr>
-              <w:spacing w:after="40"/>
-            </w:pPr>
-            <w:r>
-              <w:rPr>
-                <w:rFonts w:ascii="Arial" w:cs="Arial" w:eastAsia="Arial" w:hAnsi="Arial"/>
-              </w:rPr>
-              <w:t xml:space="preserve">YEBA FORMATIONS — SIRET 814 622 262 00032 — NDA 04973676397</w:t>
+            <w:shd w:fill="EEF1F6" w:color="auto" w:val="clear"/>
+            <w:tcMar>
+              <w:top w:type="dxa" w:w="60"/>
+              <w:left w:type="dxa" w:w="90"/>
+              <w:bottom w:type="dxa" w:w="60"/>
+              <w:right w:type="dxa" w:w="90"/>
+            </w:tcMar>
+          </w:tcPr>
+          <w:p>
+            <w:pPr>
+              <w:spacing w:after="40"/>
+            </w:pPr>
+            <w:r>
+              <w:rPr>
+                <w:rFonts w:ascii="Inter" w:cs="Inter" w:eastAsia="Inter" w:hAnsi="Inter"/>
+              </w:rPr>
+              <w:t xml:space="preserve">YEBA FORMATIONS — SIRET 814 622 262 00032 — NDA 04973676397 — UAI 9742022E</w:t>
             </w:r>
           </w:p>
         </w:tc>
@@ -361,9 +372,9 @@
             </w:pPr>
             <w:r>
               <w:rPr>
-                <w:rFonts w:ascii="Arial" w:cs="Arial" w:eastAsia="Arial" w:hAnsi="Arial"/>
-              </w:rPr>
-              <w:t xml:space="preserve">Certification Qualiopi</w:t>
+                <w:rFonts w:ascii="Inter" w:cs="Inter" w:eastAsia="Inter" w:hAnsi="Inter"/>
+              </w:rPr>
+              <w:t xml:space="preserve">Lieu de formation</w:t>
             </w:r>
           </w:p>
         </w:tc>
@@ -383,19 +394,9 @@
             </w:pPr>
             <w:r>
               <w:rPr>
-                <w:rFonts w:ascii="Arial" w:cs="Arial" w:eastAsia="Arial" w:hAnsi="Arial"/>
-              </w:rPr>
-              <w:t xml:space="preserve">n° 25FOR02027.1 — </w:t>
-            </w:r>
-            <w:r>
-              <w:rPr>
-                <w:rFonts w:ascii="Arial" w:cs="Arial" w:eastAsia="Arial" w:hAnsi="Arial"/>
-                <w:b/>
-                <w:bCs/>
-                <w:highlight w:val="yellow"/>
-                <w:highlightCs w:val="yellow"/>
-              </w:rPr>
-              <w:t xml:space="preserve">[préciser si la catégorie « actions de formation par apprentissage » est déjà couverte ou en cours d’extension]</w:t>
+                <w:rFonts w:ascii="Inter" w:cs="Inter" w:eastAsia="Inter" w:hAnsi="Inter"/>
+              </w:rPr>
+              <w:t xml:space="preserve">7 rue Henri Cornu, Immeuble Rodrigue 2, Technopole Réunion / Technor, 97490 Sainte-Clotilde (Saint-Denis)</w:t>
             </w:r>
           </w:p>
         </w:tc>
@@ -407,46 +408,46 @@
         <w:tc>
           <w:tcPr>
             <w:tcW w:type="dxa" w:w="2600"/>
-            <w:shd w:fill="EAF0F6" w:color="auto" w:val="clear"/>
-            <w:tcMar>
-              <w:top w:type="dxa" w:w="60"/>
-              <w:left w:type="dxa" w:w="90"/>
-              <w:bottom w:type="dxa" w:w="60"/>
-              <w:right w:type="dxa" w:w="90"/>
-            </w:tcMar>
-          </w:tcPr>
-          <w:p>
-            <w:pPr>
-              <w:spacing w:after="40"/>
-            </w:pPr>
-            <w:r>
-              <w:rPr>
-                <w:rFonts w:ascii="Arial" w:cs="Arial" w:eastAsia="Arial" w:hAnsi="Arial"/>
-              </w:rPr>
-              <w:t xml:space="preserve">Responsable</w:t>
+            <w:shd w:fill="EEF1F6" w:color="auto" w:val="clear"/>
+            <w:tcMar>
+              <w:top w:type="dxa" w:w="60"/>
+              <w:left w:type="dxa" w:w="90"/>
+              <w:bottom w:type="dxa" w:w="60"/>
+              <w:right w:type="dxa" w:w="90"/>
+            </w:tcMar>
+          </w:tcPr>
+          <w:p>
+            <w:pPr>
+              <w:spacing w:after="40"/>
+            </w:pPr>
+            <w:r>
+              <w:rPr>
+                <w:rFonts w:ascii="Inter" w:cs="Inter" w:eastAsia="Inter" w:hAnsi="Inter"/>
+              </w:rPr>
+              <w:t xml:space="preserve">Certification Qualiopi</w:t>
             </w:r>
           </w:p>
         </w:tc>
         <w:tc>
           <w:tcPr>
             <w:tcW w:type="dxa" w:w="7038"/>
-            <w:shd w:fill="EAF0F6" w:color="auto" w:val="clear"/>
-            <w:tcMar>
-              <w:top w:type="dxa" w:w="60"/>
-              <w:left w:type="dxa" w:w="90"/>
-              <w:bottom w:type="dxa" w:w="60"/>
-              <w:right w:type="dxa" w:w="90"/>
-            </w:tcMar>
-          </w:tcPr>
-          <w:p>
-            <w:pPr>
-              <w:spacing w:after="40"/>
-            </w:pPr>
-            <w:r>
-              <w:rPr>
-                <w:rFonts w:ascii="Arial" w:cs="Arial" w:eastAsia="Arial" w:hAnsi="Arial"/>
-              </w:rPr>
-              <w:t xml:space="preserve">Aurélien LUMEKA, Directeur</w:t>
+            <w:shd w:fill="EEF1F6" w:color="auto" w:val="clear"/>
+            <w:tcMar>
+              <w:top w:type="dxa" w:w="60"/>
+              <w:left w:type="dxa" w:w="90"/>
+              <w:bottom w:type="dxa" w:w="60"/>
+              <w:right w:type="dxa" w:w="90"/>
+            </w:tcMar>
+          </w:tcPr>
+          <w:p>
+            <w:pPr>
+              <w:spacing w:after="40"/>
+            </w:pPr>
+            <w:r>
+              <w:rPr>
+                <w:rFonts w:ascii="Inter" w:cs="Inter" w:eastAsia="Inter" w:hAnsi="Inter"/>
+              </w:rPr>
+              <w:t xml:space="preserve">n° 25FOR02027.1 (actions de formation). Extension à la catégorie « actions de formation par apprentissage » engagée : l’audit d’extension sera réalisé dès l’entrée en formation du premier apprenti (courriel de l’organisme certificateur du 14/10/2026).</w:t>
             </w:r>
           </w:p>
         </w:tc>
@@ -471,7 +472,57 @@
             </w:pPr>
             <w:r>
               <w:rPr>
-                <w:rFonts w:ascii="Arial" w:cs="Arial" w:eastAsia="Arial" w:hAnsi="Arial"/>
+                <w:rFonts w:ascii="Inter" w:cs="Inter" w:eastAsia="Inter" w:hAnsi="Inter"/>
+              </w:rPr>
+              <w:t xml:space="preserve">Responsable</w:t>
+            </w:r>
+          </w:p>
+        </w:tc>
+        <w:tc>
+          <w:tcPr>
+            <w:tcW w:type="dxa" w:w="7038"/>
+            <w:tcMar>
+              <w:top w:type="dxa" w:w="60"/>
+              <w:left w:type="dxa" w:w="90"/>
+              <w:bottom w:type="dxa" w:w="60"/>
+              <w:right w:type="dxa" w:w="90"/>
+            </w:tcMar>
+          </w:tcPr>
+          <w:p>
+            <w:pPr>
+              <w:spacing w:after="40"/>
+            </w:pPr>
+            <w:r>
+              <w:rPr>
+                <w:rFonts w:ascii="Inter" w:cs="Inter" w:eastAsia="Inter" w:hAnsi="Inter"/>
+              </w:rPr>
+              <w:t xml:space="preserve">Aurélien LUMEKA, Directeur</w:t>
+            </w:r>
+          </w:p>
+        </w:tc>
+      </w:tr>
+      <w:tr>
+        <w:trPr>
+          <w:cantSplit/>
+        </w:trPr>
+        <w:tc>
+          <w:tcPr>
+            <w:tcW w:type="dxa" w:w="2600"/>
+            <w:shd w:fill="EEF1F6" w:color="auto" w:val="clear"/>
+            <w:tcMar>
+              <w:top w:type="dxa" w:w="60"/>
+              <w:left w:type="dxa" w:w="90"/>
+              <w:bottom w:type="dxa" w:w="60"/>
+              <w:right w:type="dxa" w:w="90"/>
+            </w:tcMar>
+          </w:tcPr>
+          <w:p>
+            <w:pPr>
+              <w:spacing w:after="40"/>
+            </w:pPr>
+            <w:r>
+              <w:rPr>
+                <w:rFonts w:ascii="Inter" w:cs="Inter" w:eastAsia="Inter" w:hAnsi="Inter"/>
               </w:rPr>
               <w:t xml:space="preserve">Version</w:t>
             </w:r>
@@ -480,22 +531,23 @@
         <w:tc>
           <w:tcPr>
             <w:tcW w:type="dxa" w:w="7038"/>
-            <w:tcMar>
-              <w:top w:type="dxa" w:w="60"/>
-              <w:left w:type="dxa" w:w="90"/>
-              <w:bottom w:type="dxa" w:w="60"/>
-              <w:right w:type="dxa" w:w="90"/>
-            </w:tcMar>
-          </w:tcPr>
-          <w:p>
-            <w:pPr>
-              <w:spacing w:after="40"/>
-            </w:pPr>
-            <w:r>
-              <w:rPr>
-                <w:rFonts w:ascii="Arial" w:cs="Arial" w:eastAsia="Arial" w:hAnsi="Arial"/>
-              </w:rPr>
-              <w:t xml:space="preserve">Version 1 du 28/10/2026</w:t>
+            <w:shd w:fill="EEF1F6" w:color="auto" w:val="clear"/>
+            <w:tcMar>
+              <w:top w:type="dxa" w:w="60"/>
+              <w:left w:type="dxa" w:w="90"/>
+              <w:bottom w:type="dxa" w:w="60"/>
+              <w:right w:type="dxa" w:w="90"/>
+            </w:tcMar>
+          </w:tcPr>
+          <w:p>
+            <w:pPr>
+              <w:spacing w:after="40"/>
+            </w:pPr>
+            <w:r>
+              <w:rPr>
+                <w:rFonts w:ascii="Inter" w:cs="Inter" w:eastAsia="Inter" w:hAnsi="Inter"/>
+              </w:rPr>
+              <w:t xml:space="preserve">Version 2 du 28/10/2026</w:t>
             </w:r>
           </w:p>
         </w:tc>
@@ -514,7 +566,7 @@
       </w:pPr>
       <w:r>
         <w:rPr>
-          <w:rFonts w:ascii="Arial" w:cs="Arial" w:eastAsia="Arial" w:hAnsi="Arial"/>
+          <w:rFonts w:ascii="Montserrat" w:cs="Montserrat" w:eastAsia="Montserrat" w:hAnsi="Montserrat"/>
         </w:rPr>
         <w:t xml:space="preserve">1. Équipe pédagogique de la première promotion</w:t>
       </w:r>
@@ -526,7 +578,7 @@
       </w:pPr>
       <w:r>
         <w:rPr>
-          <w:rFonts w:ascii="Arial" w:cs="Arial" w:eastAsia="Arial" w:hAnsi="Arial"/>
+          <w:rFonts w:ascii="Inter" w:cs="Inter" w:eastAsia="Inter" w:hAnsi="Inter"/>
         </w:rPr>
         <w:t xml:space="preserve">Le tableau ci-dessous recense les intervenants pressentis. Chaque ligne renvoie à un justificatif joint (CV daté et signé, copie des diplômes et certificats).</w:t>
       </w:r>
@@ -558,21 +610,21 @@
         <w:tc>
           <w:tcPr>
             <w:tcW w:type="dxa" w:w="1700"/>
-            <w:shd w:fill="1F3A5F" w:color="auto" w:val="clear"/>
-            <w:tcMar>
-              <w:top w:type="dxa" w:w="60"/>
-              <w:left w:type="dxa" w:w="90"/>
-              <w:bottom w:type="dxa" w:w="60"/>
-              <w:right w:type="dxa" w:w="90"/>
-            </w:tcMar>
-          </w:tcPr>
-          <w:p>
-            <w:pPr>
-              <w:spacing w:after="40"/>
-            </w:pPr>
-            <w:r>
-              <w:rPr>
-                <w:rFonts w:ascii="Arial" w:cs="Arial" w:eastAsia="Arial" w:hAnsi="Arial"/>
+            <w:shd w:fill="1B3A6B" w:color="auto" w:val="clear"/>
+            <w:tcMar>
+              <w:top w:type="dxa" w:w="60"/>
+              <w:left w:type="dxa" w:w="90"/>
+              <w:bottom w:type="dxa" w:w="60"/>
+              <w:right w:type="dxa" w:w="90"/>
+            </w:tcMar>
+          </w:tcPr>
+          <w:p>
+            <w:pPr>
+              <w:spacing w:after="40"/>
+            </w:pPr>
+            <w:r>
+              <w:rPr>
+                <w:rFonts w:ascii="Inter" w:cs="Inter" w:eastAsia="Inter" w:hAnsi="Inter"/>
                 <w:b/>
                 <w:bCs/>
                 <w:color w:val="FFFFFF"/>
@@ -584,21 +636,21 @@
         <w:tc>
           <w:tcPr>
             <w:tcW w:type="dxa" w:w="1500"/>
-            <w:shd w:fill="1F3A5F" w:color="auto" w:val="clear"/>
-            <w:tcMar>
-              <w:top w:type="dxa" w:w="60"/>
-              <w:left w:type="dxa" w:w="90"/>
-              <w:bottom w:type="dxa" w:w="60"/>
-              <w:right w:type="dxa" w:w="90"/>
-            </w:tcMar>
-          </w:tcPr>
-          <w:p>
-            <w:pPr>
-              <w:spacing w:after="40"/>
-            </w:pPr>
-            <w:r>
-              <w:rPr>
-                <w:rFonts w:ascii="Arial" w:cs="Arial" w:eastAsia="Arial" w:hAnsi="Arial"/>
+            <w:shd w:fill="1B3A6B" w:color="auto" w:val="clear"/>
+            <w:tcMar>
+              <w:top w:type="dxa" w:w="60"/>
+              <w:left w:type="dxa" w:w="90"/>
+              <w:bottom w:type="dxa" w:w="60"/>
+              <w:right w:type="dxa" w:w="90"/>
+            </w:tcMar>
+          </w:tcPr>
+          <w:p>
+            <w:pPr>
+              <w:spacing w:after="40"/>
+            </w:pPr>
+            <w:r>
+              <w:rPr>
+                <w:rFonts w:ascii="Inter" w:cs="Inter" w:eastAsia="Inter" w:hAnsi="Inter"/>
                 <w:b/>
                 <w:bCs/>
                 <w:color w:val="FFFFFF"/>
@@ -610,21 +662,21 @@
         <w:tc>
           <w:tcPr>
             <w:tcW w:type="dxa" w:w="3200"/>
-            <w:shd w:fill="1F3A5F" w:color="auto" w:val="clear"/>
-            <w:tcMar>
-              <w:top w:type="dxa" w:w="60"/>
-              <w:left w:type="dxa" w:w="90"/>
-              <w:bottom w:type="dxa" w:w="60"/>
-              <w:right w:type="dxa" w:w="90"/>
-            </w:tcMar>
-          </w:tcPr>
-          <w:p>
-            <w:pPr>
-              <w:spacing w:after="40"/>
-            </w:pPr>
-            <w:r>
-              <w:rPr>
-                <w:rFonts w:ascii="Arial" w:cs="Arial" w:eastAsia="Arial" w:hAnsi="Arial"/>
+            <w:shd w:fill="1B3A6B" w:color="auto" w:val="clear"/>
+            <w:tcMar>
+              <w:top w:type="dxa" w:w="60"/>
+              <w:left w:type="dxa" w:w="90"/>
+              <w:bottom w:type="dxa" w:w="60"/>
+              <w:right w:type="dxa" w:w="90"/>
+            </w:tcMar>
+          </w:tcPr>
+          <w:p>
+            <w:pPr>
+              <w:spacing w:after="40"/>
+            </w:pPr>
+            <w:r>
+              <w:rPr>
+                <w:rFonts w:ascii="Inter" w:cs="Inter" w:eastAsia="Inter" w:hAnsi="Inter"/>
                 <w:b/>
                 <w:bCs/>
                 <w:color w:val="FFFFFF"/>
@@ -636,21 +688,21 @@
         <w:tc>
           <w:tcPr>
             <w:tcW w:type="dxa" w:w="1800"/>
-            <w:shd w:fill="1F3A5F" w:color="auto" w:val="clear"/>
-            <w:tcMar>
-              <w:top w:type="dxa" w:w="60"/>
-              <w:left w:type="dxa" w:w="90"/>
-              <w:bottom w:type="dxa" w:w="60"/>
-              <w:right w:type="dxa" w:w="90"/>
-            </w:tcMar>
-          </w:tcPr>
-          <w:p>
-            <w:pPr>
-              <w:spacing w:after="40"/>
-            </w:pPr>
-            <w:r>
-              <w:rPr>
-                <w:rFonts w:ascii="Arial" w:cs="Arial" w:eastAsia="Arial" w:hAnsi="Arial"/>
+            <w:shd w:fill="1B3A6B" w:color="auto" w:val="clear"/>
+            <w:tcMar>
+              <w:top w:type="dxa" w:w="60"/>
+              <w:left w:type="dxa" w:w="90"/>
+              <w:bottom w:type="dxa" w:w="60"/>
+              <w:right w:type="dxa" w:w="90"/>
+            </w:tcMar>
+          </w:tcPr>
+          <w:p>
+            <w:pPr>
+              <w:spacing w:after="40"/>
+            </w:pPr>
+            <w:r>
+              <w:rPr>
+                <w:rFonts w:ascii="Inter" w:cs="Inter" w:eastAsia="Inter" w:hAnsi="Inter"/>
                 <w:b/>
                 <w:bCs/>
                 <w:color w:val="FFFFFF"/>
@@ -662,26 +714,254 @@
         <w:tc>
           <w:tcPr>
             <w:tcW w:type="dxa" w:w="1438"/>
-            <w:shd w:fill="1F3A5F" w:color="auto" w:val="clear"/>
-            <w:tcMar>
-              <w:top w:type="dxa" w:w="60"/>
-              <w:left w:type="dxa" w:w="90"/>
-              <w:bottom w:type="dxa" w:w="60"/>
-              <w:right w:type="dxa" w:w="90"/>
-            </w:tcMar>
-          </w:tcPr>
-          <w:p>
-            <w:pPr>
-              <w:spacing w:after="40"/>
-            </w:pPr>
-            <w:r>
-              <w:rPr>
-                <w:rFonts w:ascii="Arial" w:cs="Arial" w:eastAsia="Arial" w:hAnsi="Arial"/>
+            <w:shd w:fill="1B3A6B" w:color="auto" w:val="clear"/>
+            <w:tcMar>
+              <w:top w:type="dxa" w:w="60"/>
+              <w:left w:type="dxa" w:w="90"/>
+              <w:bottom w:type="dxa" w:w="60"/>
+              <w:right w:type="dxa" w:w="90"/>
+            </w:tcMar>
+          </w:tcPr>
+          <w:p>
+            <w:pPr>
+              <w:spacing w:after="40"/>
+            </w:pPr>
+            <w:r>
+              <w:rPr>
+                <w:rFonts w:ascii="Inter" w:cs="Inter" w:eastAsia="Inter" w:hAnsi="Inter"/>
                 <w:b/>
                 <w:bCs/>
                 <w:color w:val="FFFFFF"/>
               </w:rPr>
               <w:t xml:space="preserve">Justificatifs</w:t>
+            </w:r>
+          </w:p>
+        </w:tc>
+      </w:tr>
+      <w:tr>
+        <w:trPr>
+          <w:cantSplit w:val="false"/>
+        </w:trPr>
+        <w:tc>
+          <w:tcPr>
+            <w:tcW w:type="dxa" w:w="1700"/>
+            <w:tcMar>
+              <w:top w:type="dxa" w:w="60"/>
+              <w:left w:type="dxa" w:w="90"/>
+              <w:bottom w:type="dxa" w:w="60"/>
+              <w:right w:type="dxa" w:w="90"/>
+            </w:tcMar>
+          </w:tcPr>
+          <w:p>
+            <w:pPr>
+              <w:spacing w:after="40"/>
+            </w:pPr>
+            <w:r>
+              <w:rPr>
+                <w:rFonts w:ascii="Inter" w:cs="Inter" w:eastAsia="Inter" w:hAnsi="Inter"/>
+              </w:rPr>
+              <w:t xml:space="preserve">Aurélien LUMEKA</w:t>
+            </w:r>
+          </w:p>
+        </w:tc>
+        <w:tc>
+          <w:tcPr>
+            <w:tcW w:type="dxa" w:w="1500"/>
+            <w:tcMar>
+              <w:top w:type="dxa" w:w="60"/>
+              <w:left w:type="dxa" w:w="90"/>
+              <w:bottom w:type="dxa" w:w="60"/>
+              <w:right w:type="dxa" w:w="90"/>
+            </w:tcMar>
+          </w:tcPr>
+          <w:p>
+            <w:pPr>
+              <w:spacing w:after="40"/>
+            </w:pPr>
+            <w:r>
+              <w:rPr>
+                <w:rFonts w:ascii="Inter" w:cs="Inter" w:eastAsia="Inter" w:hAnsi="Inter"/>
+              </w:rPr>
+              <w:t xml:space="preserve">Dirigeant, formateur permanent</w:t>
+            </w:r>
+          </w:p>
+        </w:tc>
+        <w:tc>
+          <w:tcPr>
+            <w:tcW w:type="dxa" w:w="3200"/>
+            <w:tcMar>
+              <w:top w:type="dxa" w:w="60"/>
+              <w:left w:type="dxa" w:w="90"/>
+              <w:bottom w:type="dxa" w:w="60"/>
+              <w:right w:type="dxa" w:w="90"/>
+            </w:tcMar>
+          </w:tcPr>
+          <w:p>
+            <w:pPr>
+              <w:spacing w:after="40"/>
+            </w:pPr>
+            <w:r>
+              <w:rPr>
+                <w:rFonts w:ascii="Inter" w:cs="Inter" w:eastAsia="Inter" w:hAnsi="Inter"/>
+              </w:rPr>
+              <w:t xml:space="preserve">Formateur en vente, négociation, management et soft skills depuis 2021 dans plusieurs centres de formation de La Réunion</w:t>
+            </w:r>
+          </w:p>
+          <w:p>
+            <w:pPr>
+              <w:spacing w:after="40"/>
+            </w:pPr>
+            <w:r>
+              <w:rPr>
+                <w:rFonts w:ascii="Inter" w:cs="Inter" w:eastAsia="Inter" w:hAnsi="Inter"/>
+              </w:rPr>
+              <w:t xml:space="preserve">Formateur en IA, implémentation de workflows et gouvernance RGPD / IA Act depuis 2026</w:t>
+            </w:r>
+          </w:p>
+          <w:p>
+            <w:pPr>
+              <w:spacing w:after="40"/>
+            </w:pPr>
+            <w:r>
+              <w:rPr>
+                <w:rFonts w:ascii="Inter" w:cs="Inter" w:eastAsia="Inter" w:hAnsi="Inter"/>
+              </w:rPr>
+              <w:t xml:space="preserve">Google AI Specialist ; Google Professional AI</w:t>
+            </w:r>
+          </w:p>
+          <w:p>
+            <w:pPr>
+              <w:spacing w:after="40"/>
+            </w:pPr>
+            <w:r>
+              <w:rPr>
+                <w:rFonts w:ascii="Inter" w:cs="Inter" w:eastAsia="Inter" w:hAnsi="Inter"/>
+              </w:rPr>
+              <w:t xml:space="preserve">Référent handicap en organisme de formation</w:t>
+            </w:r>
+          </w:p>
+          <w:p>
+            <w:pPr>
+              <w:spacing w:after="40"/>
+            </w:pPr>
+            <w:r>
+              <w:rPr>
+                <w:rFonts w:ascii="Inter" w:cs="Inter" w:eastAsia="Inter" w:hAnsi="Inter"/>
+              </w:rPr>
+              <w:t xml:space="preserve">SecNumacadémie (ANSSI)</w:t>
+            </w:r>
+          </w:p>
+          <w:p>
+            <w:pPr>
+              <w:spacing w:after="40"/>
+            </w:pPr>
+            <w:r>
+              <w:rPr>
+                <w:rFonts w:ascii="Inter" w:cs="Inter" w:eastAsia="Inter" w:hAnsi="Inter"/>
+              </w:rPr>
+              <w:t xml:space="preserve">MOOC RGPD de la CNIL</w:t>
+            </w:r>
+          </w:p>
+          <w:p>
+            <w:pPr>
+              <w:spacing w:after="40"/>
+            </w:pPr>
+            <w:r>
+              <w:rPr>
+                <w:rFonts w:ascii="Inter" w:cs="Inter" w:eastAsia="Inter" w:hAnsi="Inter"/>
+                <w:b/>
+                <w:bCs/>
+                <w:highlight w:val="yellow"/>
+                <w:highlightCs w:val="yellow"/>
+              </w:rPr>
+              <w:t xml:space="preserve">[diplôme(s) initial(aux)]</w:t>
+            </w:r>
+          </w:p>
+        </w:tc>
+        <w:tc>
+          <w:tcPr>
+            <w:tcW w:type="dxa" w:w="1800"/>
+            <w:tcMar>
+              <w:top w:type="dxa" w:w="60"/>
+              <w:left w:type="dxa" w:w="90"/>
+              <w:bottom w:type="dxa" w:w="60"/>
+              <w:right w:type="dxa" w:w="90"/>
+            </w:tcMar>
+          </w:tcPr>
+          <w:p>
+            <w:pPr>
+              <w:spacing w:after="40"/>
+            </w:pPr>
+            <w:r>
+              <w:rPr>
+                <w:rFonts w:ascii="Inter" w:cs="Inter" w:eastAsia="Inter" w:hAnsi="Inter"/>
+              </w:rPr>
+              <w:t xml:space="preserve">MEM : CCP 1, 2 et 3</w:t>
+            </w:r>
+          </w:p>
+          <w:p>
+            <w:pPr>
+              <w:spacing w:after="40"/>
+            </w:pPr>
+            <w:r>
+              <w:rPr>
+                <w:rFonts w:ascii="Inter" w:cs="Inter" w:eastAsia="Inter" w:hAnsi="Inter"/>
+              </w:rPr>
+              <w:t xml:space="preserve">Product Builder : gestion de projet, automatisation, données, RGPD et IA Act</w:t>
+            </w:r>
+          </w:p>
+          <w:p>
+            <w:pPr>
+              <w:spacing w:after="40"/>
+            </w:pPr>
+            <w:r>
+              <w:rPr>
+                <w:rFonts w:ascii="Inter" w:cs="Inter" w:eastAsia="Inter" w:hAnsi="Inter"/>
+              </w:rPr>
+              <w:t xml:space="preserve">Responsable RH : management, communication, RGPD et IA</w:t>
+            </w:r>
+          </w:p>
+          <w:p>
+            <w:pPr>
+              <w:spacing w:after="40"/>
+            </w:pPr>
+            <w:r>
+              <w:rPr>
+                <w:rFonts w:ascii="Inter" w:cs="Inter" w:eastAsia="Inter" w:hAnsi="Inter"/>
+              </w:rPr>
+              <w:t xml:space="preserve">Modules transverses</w:t>
+            </w:r>
+          </w:p>
+        </w:tc>
+        <w:tc>
+          <w:tcPr>
+            <w:tcW w:type="dxa" w:w="1438"/>
+            <w:tcMar>
+              <w:top w:type="dxa" w:w="60"/>
+              <w:left w:type="dxa" w:w="90"/>
+              <w:bottom w:type="dxa" w:w="60"/>
+              <w:right w:type="dxa" w:w="90"/>
+            </w:tcMar>
+          </w:tcPr>
+          <w:p>
+            <w:pPr>
+              <w:spacing w:after="40"/>
+            </w:pPr>
+            <w:r>
+              <w:rPr>
+                <w:rFonts w:ascii="Inter" w:cs="Inter" w:eastAsia="Inter" w:hAnsi="Inter"/>
+              </w:rPr>
+              <w:t xml:space="preserve">CV ; copies des attestations ; </w:t>
+            </w:r>
+            <w:r>
+              <w:rPr>
+                <w:rFonts w:ascii="Inter" w:cs="Inter" w:eastAsia="Inter" w:hAnsi="Inter"/>
+                <w:b/>
+                <w:bCs/>
+                <w:highlight w:val="yellow"/>
+                <w:highlightCs w:val="yellow"/>
+              </w:rPr>
+              <w:t xml:space="preserve">[diplômes]</w:t>
             </w:r>
           </w:p>
         </w:tc>
@@ -693,179 +973,127 @@
         <w:tc>
           <w:tcPr>
             <w:tcW w:type="dxa" w:w="1700"/>
-            <w:tcMar>
-              <w:top w:type="dxa" w:w="60"/>
-              <w:left w:type="dxa" w:w="90"/>
-              <w:bottom w:type="dxa" w:w="60"/>
-              <w:right w:type="dxa" w:w="90"/>
-            </w:tcMar>
-          </w:tcPr>
-          <w:p>
-            <w:pPr>
-              <w:spacing w:after="40"/>
-            </w:pPr>
-            <w:r>
-              <w:rPr>
-                <w:rFonts w:ascii="Arial" w:cs="Arial" w:eastAsia="Arial" w:hAnsi="Arial"/>
-              </w:rPr>
-              <w:t xml:space="preserve">Aurélien LUMEKA</w:t>
-            </w:r>
-          </w:p>
-        </w:tc>
-        <w:tc>
-          <w:tcPr>
-            <w:tcW w:type="dxa" w:w="1500"/>
-            <w:tcMar>
-              <w:top w:type="dxa" w:w="60"/>
-              <w:left w:type="dxa" w:w="90"/>
-              <w:bottom w:type="dxa" w:w="60"/>
-              <w:right w:type="dxa" w:w="90"/>
-            </w:tcMar>
-          </w:tcPr>
-          <w:p>
-            <w:pPr>
-              <w:spacing w:after="40"/>
-            </w:pPr>
-            <w:r>
-              <w:rPr>
-                <w:rFonts w:ascii="Arial" w:cs="Arial" w:eastAsia="Arial" w:hAnsi="Arial"/>
-              </w:rPr>
-              <w:t xml:space="preserve">Directeur, formateur</w:t>
-            </w:r>
-          </w:p>
-        </w:tc>
-        <w:tc>
-          <w:tcPr>
-            <w:tcW w:type="dxa" w:w="3200"/>
-            <w:tcMar>
-              <w:top w:type="dxa" w:w="60"/>
-              <w:left w:type="dxa" w:w="90"/>
-              <w:bottom w:type="dxa" w:w="60"/>
-              <w:right w:type="dxa" w:w="90"/>
-            </w:tcMar>
-          </w:tcPr>
-          <w:p>
-            <w:pPr>
-              <w:spacing w:after="40"/>
-            </w:pPr>
-            <w:r>
-              <w:rPr>
-                <w:rFonts w:ascii="Arial" w:cs="Arial" w:eastAsia="Arial" w:hAnsi="Arial"/>
-              </w:rPr>
-              <w:t xml:space="preserve">Formateur en vente, négociation et management depuis 2021 dans plusieurs centres de formation de La Réunion</w:t>
-            </w:r>
-          </w:p>
-          <w:p>
-            <w:pPr>
-              <w:spacing w:after="40"/>
-            </w:pPr>
-            <w:r>
-              <w:rPr>
-                <w:rFonts w:ascii="Arial" w:cs="Arial" w:eastAsia="Arial" w:hAnsi="Arial"/>
-              </w:rPr>
-              <w:t xml:space="preserve">Google AI Specialist ; Google Professional AI</w:t>
-            </w:r>
-          </w:p>
-          <w:p>
-            <w:pPr>
-              <w:spacing w:after="40"/>
-            </w:pPr>
-            <w:r>
-              <w:rPr>
-                <w:rFonts w:ascii="Arial" w:cs="Arial" w:eastAsia="Arial" w:hAnsi="Arial"/>
-              </w:rPr>
-              <w:t xml:space="preserve">Référent handicap en organisme de formation</w:t>
-            </w:r>
-          </w:p>
-          <w:p>
-            <w:pPr>
-              <w:spacing w:after="40"/>
-            </w:pPr>
-            <w:r>
-              <w:rPr>
-                <w:rFonts w:ascii="Arial" w:cs="Arial" w:eastAsia="Arial" w:hAnsi="Arial"/>
-              </w:rPr>
-              <w:t xml:space="preserve">SecNumacadémie (ANSSI)</w:t>
-            </w:r>
-          </w:p>
-          <w:p>
-            <w:pPr>
-              <w:spacing w:after="40"/>
-            </w:pPr>
-            <w:r>
-              <w:rPr>
-                <w:rFonts w:ascii="Arial" w:cs="Arial" w:eastAsia="Arial" w:hAnsi="Arial"/>
-              </w:rPr>
-              <w:t xml:space="preserve">MOOC RGPD de la CNIL</w:t>
-            </w:r>
-          </w:p>
-          <w:p>
-            <w:pPr>
-              <w:spacing w:after="40"/>
-            </w:pPr>
-            <w:r>
-              <w:rPr>
-                <w:rFonts w:ascii="Arial" w:cs="Arial" w:eastAsia="Arial" w:hAnsi="Arial"/>
+            <w:shd w:fill="EEF1F6" w:color="auto" w:val="clear"/>
+            <w:tcMar>
+              <w:top w:type="dxa" w:w="60"/>
+              <w:left w:type="dxa" w:w="90"/>
+              <w:bottom w:type="dxa" w:w="60"/>
+              <w:right w:type="dxa" w:w="90"/>
+            </w:tcMar>
+          </w:tcPr>
+          <w:p>
+            <w:pPr>
+              <w:spacing w:after="40"/>
+            </w:pPr>
+            <w:r>
+              <w:rPr>
+                <w:rFonts w:ascii="Inter" w:cs="Inter" w:eastAsia="Inter" w:hAnsi="Inter"/>
                 <w:b/>
                 <w:bCs/>
                 <w:highlight w:val="yellow"/>
                 <w:highlightCs w:val="yellow"/>
               </w:rPr>
-              <w:t xml:space="preserve">[diplôme(s) initial(aux) et titre de formateur éventuel]</w:t>
-            </w:r>
-          </w:p>
-        </w:tc>
-        <w:tc>
-          <w:tcPr>
-            <w:tcW w:type="dxa" w:w="1800"/>
-            <w:tcMar>
-              <w:top w:type="dxa" w:w="60"/>
-              <w:left w:type="dxa" w:w="90"/>
-              <w:bottom w:type="dxa" w:w="60"/>
-              <w:right w:type="dxa" w:w="90"/>
-            </w:tcMar>
-          </w:tcPr>
-          <w:p>
-            <w:pPr>
-              <w:spacing w:after="40"/>
-            </w:pPr>
-            <w:r>
-              <w:rPr>
-                <w:rFonts w:ascii="Arial" w:cs="Arial" w:eastAsia="Arial" w:hAnsi="Arial"/>
-              </w:rPr>
-              <w:t xml:space="preserve">Vente, négociation, relation client, management, outils numériques et IA, RGPD</w:t>
-            </w:r>
-          </w:p>
-        </w:tc>
-        <w:tc>
-          <w:tcPr>
-            <w:tcW w:type="dxa" w:w="1438"/>
-            <w:tcMar>
-              <w:top w:type="dxa" w:w="60"/>
-              <w:left w:type="dxa" w:w="90"/>
-              <w:bottom w:type="dxa" w:w="60"/>
-              <w:right w:type="dxa" w:w="90"/>
-            </w:tcMar>
-          </w:tcPr>
-          <w:p>
-            <w:pPr>
-              <w:spacing w:after="40"/>
-            </w:pPr>
-            <w:r>
-              <w:rPr>
-                <w:rFonts w:ascii="Arial" w:cs="Arial" w:eastAsia="Arial" w:hAnsi="Arial"/>
-              </w:rPr>
-              <w:t xml:space="preserve">CV ; copies des attestations ; </w:t>
-            </w:r>
-            <w:r>
-              <w:rPr>
-                <w:rFonts w:ascii="Arial" w:cs="Arial" w:eastAsia="Arial" w:hAnsi="Arial"/>
+              <w:t xml:space="preserve">[Intervenant expert RH à identifier]</w:t>
+            </w:r>
+          </w:p>
+        </w:tc>
+        <w:tc>
+          <w:tcPr>
+            <w:tcW w:type="dxa" w:w="1500"/>
+            <w:shd w:fill="EEF1F6" w:color="auto" w:val="clear"/>
+            <w:tcMar>
+              <w:top w:type="dxa" w:w="60"/>
+              <w:left w:type="dxa" w:w="90"/>
+              <w:bottom w:type="dxa" w:w="60"/>
+              <w:right w:type="dxa" w:w="90"/>
+            </w:tcMar>
+          </w:tcPr>
+          <w:p>
+            <w:pPr>
+              <w:spacing w:after="40"/>
+            </w:pPr>
+            <w:r>
+              <w:rPr>
+                <w:rFonts w:ascii="Inter" w:cs="Inter" w:eastAsia="Inter" w:hAnsi="Inter"/>
+              </w:rPr>
+              <w:t xml:space="preserve">Sous-traitant (à contractualiser)</w:t>
+            </w:r>
+          </w:p>
+        </w:tc>
+        <w:tc>
+          <w:tcPr>
+            <w:tcW w:type="dxa" w:w="3200"/>
+            <w:shd w:fill="EEF1F6" w:color="auto" w:val="clear"/>
+            <w:tcMar>
+              <w:top w:type="dxa" w:w="60"/>
+              <w:left w:type="dxa" w:w="90"/>
+              <w:bottom w:type="dxa" w:w="60"/>
+              <w:right w:type="dxa" w:w="90"/>
+            </w:tcMar>
+          </w:tcPr>
+          <w:p>
+            <w:pPr>
+              <w:spacing w:after="40"/>
+            </w:pPr>
+            <w:r>
+              <w:rPr>
+                <w:rFonts w:ascii="Inter" w:cs="Inter" w:eastAsia="Inter" w:hAnsi="Inter"/>
                 <w:b/>
                 <w:bCs/>
                 <w:highlight w:val="yellow"/>
                 <w:highlightCs w:val="yellow"/>
               </w:rPr>
-              <w:t xml:space="preserve">[diplômes]</w:t>
+              <w:t xml:space="preserve">[Diplôme RH de niveau 6 ou 7 et expérience de responsable RH]</w:t>
+            </w:r>
+          </w:p>
+        </w:tc>
+        <w:tc>
+          <w:tcPr>
+            <w:tcW w:type="dxa" w:w="1800"/>
+            <w:shd w:fill="EEF1F6" w:color="auto" w:val="clear"/>
+            <w:tcMar>
+              <w:top w:type="dxa" w:w="60"/>
+              <w:left w:type="dxa" w:w="90"/>
+              <w:bottom w:type="dxa" w:w="60"/>
+              <w:right w:type="dxa" w:w="90"/>
+            </w:tcMar>
+          </w:tcPr>
+          <w:p>
+            <w:pPr>
+              <w:spacing w:after="40"/>
+            </w:pPr>
+            <w:r>
+              <w:rPr>
+                <w:rFonts w:ascii="Inter" w:cs="Inter" w:eastAsia="Inter" w:hAnsi="Inter"/>
+              </w:rPr>
+              <w:t xml:space="preserve">Responsable RH : droit du travail, paie, GEPP</w:t>
+            </w:r>
+          </w:p>
+        </w:tc>
+        <w:tc>
+          <w:tcPr>
+            <w:tcW w:type="dxa" w:w="1438"/>
+            <w:shd w:fill="EEF1F6" w:color="auto" w:val="clear"/>
+            <w:tcMar>
+              <w:top w:type="dxa" w:w="60"/>
+              <w:left w:type="dxa" w:w="90"/>
+              <w:bottom w:type="dxa" w:w="60"/>
+              <w:right w:type="dxa" w:w="90"/>
+            </w:tcMar>
+          </w:tcPr>
+          <w:p>
+            <w:pPr>
+              <w:spacing w:after="40"/>
+            </w:pPr>
+            <w:r>
+              <w:rPr>
+                <w:rFonts w:ascii="Inter" w:cs="Inter" w:eastAsia="Inter" w:hAnsi="Inter"/>
+                <w:b/>
+                <w:bCs/>
+                <w:highlight w:val="yellow"/>
+                <w:highlightCs w:val="yellow"/>
+              </w:rPr>
+              <w:t xml:space="preserve">[CV, diplômes, contrat de sous-traitance]</w:t>
             </w:r>
           </w:p>
         </w:tc>
@@ -877,270 +1105,122 @@
         <w:tc>
           <w:tcPr>
             <w:tcW w:type="dxa" w:w="1700"/>
-            <w:shd w:fill="EAF0F6" w:color="auto" w:val="clear"/>
-            <w:tcMar>
-              <w:top w:type="dxa" w:w="60"/>
-              <w:left w:type="dxa" w:w="90"/>
-              <w:bottom w:type="dxa" w:w="60"/>
-              <w:right w:type="dxa" w:w="90"/>
-            </w:tcMar>
-          </w:tcPr>
-          <w:p>
-            <w:pPr>
-              <w:spacing w:after="40"/>
-            </w:pPr>
-            <w:r>
-              <w:rPr>
-                <w:rFonts w:ascii="Arial" w:cs="Arial" w:eastAsia="Arial" w:hAnsi="Arial"/>
+            <w:tcMar>
+              <w:top w:type="dxa" w:w="60"/>
+              <w:left w:type="dxa" w:w="90"/>
+              <w:bottom w:type="dxa" w:w="60"/>
+              <w:right w:type="dxa" w:w="90"/>
+            </w:tcMar>
+          </w:tcPr>
+          <w:p>
+            <w:pPr>
+              <w:spacing w:after="40"/>
+            </w:pPr>
+            <w:r>
+              <w:rPr>
+                <w:rFonts w:ascii="Inter" w:cs="Inter" w:eastAsia="Inter" w:hAnsi="Inter"/>
                 <w:b/>
                 <w:bCs/>
                 <w:highlight w:val="yellow"/>
                 <w:highlightCs w:val="yellow"/>
               </w:rPr>
-              <w:t xml:space="preserve">[Nom]</w:t>
+              <w:t xml:space="preserve">[Intervenant expert no-code à identifier]</w:t>
             </w:r>
           </w:p>
         </w:tc>
         <w:tc>
           <w:tcPr>
             <w:tcW w:type="dxa" w:w="1500"/>
-            <w:shd w:fill="EAF0F6" w:color="auto" w:val="clear"/>
-            <w:tcMar>
-              <w:top w:type="dxa" w:w="60"/>
-              <w:left w:type="dxa" w:w="90"/>
-              <w:bottom w:type="dxa" w:w="60"/>
-              <w:right w:type="dxa" w:w="90"/>
-            </w:tcMar>
-          </w:tcPr>
-          <w:p>
-            <w:pPr>
-              <w:spacing w:after="40"/>
-            </w:pPr>
-            <w:r>
-              <w:rPr>
-                <w:rFonts w:ascii="Arial" w:cs="Arial" w:eastAsia="Arial" w:hAnsi="Arial"/>
+            <w:tcMar>
+              <w:top w:type="dxa" w:w="60"/>
+              <w:left w:type="dxa" w:w="90"/>
+              <w:bottom w:type="dxa" w:w="60"/>
+              <w:right w:type="dxa" w:w="90"/>
+            </w:tcMar>
+          </w:tcPr>
+          <w:p>
+            <w:pPr>
+              <w:spacing w:after="40"/>
+            </w:pPr>
+            <w:r>
+              <w:rPr>
+                <w:rFonts w:ascii="Inter" w:cs="Inter" w:eastAsia="Inter" w:hAnsi="Inter"/>
+              </w:rPr>
+              <w:t xml:space="preserve">Sous-traitant (à contractualiser)</w:t>
+            </w:r>
+          </w:p>
+        </w:tc>
+        <w:tc>
+          <w:tcPr>
+            <w:tcW w:type="dxa" w:w="3200"/>
+            <w:tcMar>
+              <w:top w:type="dxa" w:w="60"/>
+              <w:left w:type="dxa" w:w="90"/>
+              <w:bottom w:type="dxa" w:w="60"/>
+              <w:right w:type="dxa" w:w="90"/>
+            </w:tcMar>
+          </w:tcPr>
+          <w:p>
+            <w:pPr>
+              <w:spacing w:after="40"/>
+            </w:pPr>
+            <w:r>
+              <w:rPr>
+                <w:rFonts w:ascii="Inter" w:cs="Inter" w:eastAsia="Inter" w:hAnsi="Inter"/>
                 <w:b/>
                 <w:bCs/>
                 <w:highlight w:val="yellow"/>
                 <w:highlightCs w:val="yellow"/>
               </w:rPr>
-              <w:t xml:space="preserve">[Salarié / indépendant / sous-traitant]</w:t>
-            </w:r>
-          </w:p>
-        </w:tc>
-        <w:tc>
-          <w:tcPr>
-            <w:tcW w:type="dxa" w:w="3200"/>
-            <w:shd w:fill="EAF0F6" w:color="auto" w:val="clear"/>
-            <w:tcMar>
-              <w:top w:type="dxa" w:w="60"/>
-              <w:left w:type="dxa" w:w="90"/>
-              <w:bottom w:type="dxa" w:w="60"/>
-              <w:right w:type="dxa" w:w="90"/>
-            </w:tcMar>
-          </w:tcPr>
-          <w:p>
-            <w:pPr>
-              <w:spacing w:after="40"/>
-            </w:pPr>
-            <w:r>
-              <w:rPr>
-                <w:rFonts w:ascii="Arial" w:cs="Arial" w:eastAsia="Arial" w:hAnsi="Arial"/>
+              <w:t xml:space="preserve">[Expérience de développement d’applications sans code]</w:t>
+            </w:r>
+          </w:p>
+        </w:tc>
+        <w:tc>
+          <w:tcPr>
+            <w:tcW w:type="dxa" w:w="1800"/>
+            <w:tcMar>
+              <w:top w:type="dxa" w:w="60"/>
+              <w:left w:type="dxa" w:w="90"/>
+              <w:bottom w:type="dxa" w:w="60"/>
+              <w:right w:type="dxa" w:w="90"/>
+            </w:tcMar>
+          </w:tcPr>
+          <w:p>
+            <w:pPr>
+              <w:spacing w:after="40"/>
+            </w:pPr>
+            <w:r>
+              <w:rPr>
+                <w:rFonts w:ascii="Inter" w:cs="Inter" w:eastAsia="Inter" w:hAnsi="Inter"/>
+              </w:rPr>
+              <w:t xml:space="preserve">Product Builder : développement et configuration d’applications</w:t>
+            </w:r>
+          </w:p>
+        </w:tc>
+        <w:tc>
+          <w:tcPr>
+            <w:tcW w:type="dxa" w:w="1438"/>
+            <w:tcMar>
+              <w:top w:type="dxa" w:w="60"/>
+              <w:left w:type="dxa" w:w="90"/>
+              <w:bottom w:type="dxa" w:w="60"/>
+              <w:right w:type="dxa" w:w="90"/>
+            </w:tcMar>
+          </w:tcPr>
+          <w:p>
+            <w:pPr>
+              <w:spacing w:after="40"/>
+            </w:pPr>
+            <w:r>
+              <w:rPr>
+                <w:rFonts w:ascii="Inter" w:cs="Inter" w:eastAsia="Inter" w:hAnsi="Inter"/>
                 <w:b/>
                 <w:bCs/>
                 <w:highlight w:val="yellow"/>
                 <w:highlightCs w:val="yellow"/>
               </w:rPr>
-              <w:t xml:space="preserve">[Diplôme et expérience professionnelle dans le métier visé]</w:t>
-            </w:r>
-          </w:p>
-        </w:tc>
-        <w:tc>
-          <w:tcPr>
-            <w:tcW w:type="dxa" w:w="1800"/>
-            <w:shd w:fill="EAF0F6" w:color="auto" w:val="clear"/>
-            <w:tcMar>
-              <w:top w:type="dxa" w:w="60"/>
-              <w:left w:type="dxa" w:w="90"/>
-              <w:bottom w:type="dxa" w:w="60"/>
-              <w:right w:type="dxa" w:w="90"/>
-            </w:tcMar>
-          </w:tcPr>
-          <w:p>
-            <w:pPr>
-              <w:spacing w:after="40"/>
-            </w:pPr>
-            <w:r>
-              <w:rPr>
-                <w:rFonts w:ascii="Arial" w:cs="Arial" w:eastAsia="Arial" w:hAnsi="Arial"/>
-                <w:b/>
-                <w:bCs/>
-                <w:highlight w:val="yellow"/>
-                <w:highlightCs w:val="yellow"/>
-              </w:rPr>
-              <w:t xml:space="preserve">[Modules]</w:t>
-            </w:r>
-          </w:p>
-        </w:tc>
-        <w:tc>
-          <w:tcPr>
-            <w:tcW w:type="dxa" w:w="1438"/>
-            <w:shd w:fill="EAF0F6" w:color="auto" w:val="clear"/>
-            <w:tcMar>
-              <w:top w:type="dxa" w:w="60"/>
-              <w:left w:type="dxa" w:w="90"/>
-              <w:bottom w:type="dxa" w:w="60"/>
-              <w:right w:type="dxa" w:w="90"/>
-            </w:tcMar>
-          </w:tcPr>
-          <w:p>
-            <w:pPr>
-              <w:spacing w:after="40"/>
-            </w:pPr>
-            <w:r>
-              <w:rPr>
-                <w:rFonts w:ascii="Arial" w:cs="Arial" w:eastAsia="Arial" w:hAnsi="Arial"/>
-                <w:b/>
-                <w:bCs/>
-                <w:highlight w:val="yellow"/>
-                <w:highlightCs w:val="yellow"/>
-              </w:rPr>
-              <w:t xml:space="preserve">[CV, diplômes, contrat]</w:t>
-            </w:r>
-          </w:p>
-        </w:tc>
-      </w:tr>
-      <w:tr>
-        <w:trPr>
-          <w:cantSplit/>
-        </w:trPr>
-        <w:tc>
-          <w:tcPr>
-            <w:tcW w:type="dxa" w:w="1700"/>
-            <w:tcMar>
-              <w:top w:type="dxa" w:w="60"/>
-              <w:left w:type="dxa" w:w="90"/>
-              <w:bottom w:type="dxa" w:w="60"/>
-              <w:right w:type="dxa" w:w="90"/>
-            </w:tcMar>
-          </w:tcPr>
-          <w:p>
-            <w:pPr>
-              <w:spacing w:after="40"/>
-            </w:pPr>
-            <w:r>
-              <w:rPr>
-                <w:rFonts w:ascii="Arial" w:cs="Arial" w:eastAsia="Arial" w:hAnsi="Arial"/>
-                <w:b/>
-                <w:bCs/>
-                <w:highlight w:val="yellow"/>
-                <w:highlightCs w:val="yellow"/>
-              </w:rPr>
-              <w:t xml:space="preserve">[Nom]</w:t>
-            </w:r>
-          </w:p>
-        </w:tc>
-        <w:tc>
-          <w:tcPr>
-            <w:tcW w:type="dxa" w:w="1500"/>
-            <w:tcMar>
-              <w:top w:type="dxa" w:w="60"/>
-              <w:left w:type="dxa" w:w="90"/>
-              <w:bottom w:type="dxa" w:w="60"/>
-              <w:right w:type="dxa" w:w="90"/>
-            </w:tcMar>
-          </w:tcPr>
-          <w:p>
-            <w:pPr>
-              <w:spacing w:after="40"/>
-            </w:pPr>
-            <w:r>
-              <w:rPr>
-                <w:rFonts w:ascii="Arial" w:cs="Arial" w:eastAsia="Arial" w:hAnsi="Arial"/>
-                <w:b/>
-                <w:bCs/>
-                <w:highlight w:val="yellow"/>
-                <w:highlightCs w:val="yellow"/>
-              </w:rPr>
-              <w:t xml:space="preserve">[Statut]</w:t>
-            </w:r>
-          </w:p>
-        </w:tc>
-        <w:tc>
-          <w:tcPr>
-            <w:tcW w:type="dxa" w:w="3200"/>
-            <w:tcMar>
-              <w:top w:type="dxa" w:w="60"/>
-              <w:left w:type="dxa" w:w="90"/>
-              <w:bottom w:type="dxa" w:w="60"/>
-              <w:right w:type="dxa" w:w="90"/>
-            </w:tcMar>
-          </w:tcPr>
-          <w:p>
-            <w:pPr>
-              <w:spacing w:after="40"/>
-            </w:pPr>
-            <w:r>
-              <w:rPr>
-                <w:rFonts w:ascii="Arial" w:cs="Arial" w:eastAsia="Arial" w:hAnsi="Arial"/>
-                <w:b/>
-                <w:bCs/>
-                <w:highlight w:val="yellow"/>
-                <w:highlightCs w:val="yellow"/>
-              </w:rPr>
-              <w:t xml:space="preserve">[Titres]</w:t>
-            </w:r>
-          </w:p>
-        </w:tc>
-        <w:tc>
-          <w:tcPr>
-            <w:tcW w:type="dxa" w:w="1800"/>
-            <w:tcMar>
-              <w:top w:type="dxa" w:w="60"/>
-              <w:left w:type="dxa" w:w="90"/>
-              <w:bottom w:type="dxa" w:w="60"/>
-              <w:right w:type="dxa" w:w="90"/>
-            </w:tcMar>
-          </w:tcPr>
-          <w:p>
-            <w:pPr>
-              <w:spacing w:after="40"/>
-            </w:pPr>
-            <w:r>
-              <w:rPr>
-                <w:rFonts w:ascii="Arial" w:cs="Arial" w:eastAsia="Arial" w:hAnsi="Arial"/>
-                <w:b/>
-                <w:bCs/>
-                <w:highlight w:val="yellow"/>
-                <w:highlightCs w:val="yellow"/>
-              </w:rPr>
-              <w:t xml:space="preserve">[Modules]</w:t>
-            </w:r>
-          </w:p>
-        </w:tc>
-        <w:tc>
-          <w:tcPr>
-            <w:tcW w:type="dxa" w:w="1438"/>
-            <w:tcMar>
-              <w:top w:type="dxa" w:w="60"/>
-              <w:left w:type="dxa" w:w="90"/>
-              <w:bottom w:type="dxa" w:w="60"/>
-              <w:right w:type="dxa" w:w="90"/>
-            </w:tcMar>
-          </w:tcPr>
-          <w:p>
-            <w:pPr>
-              <w:spacing w:after="40"/>
-            </w:pPr>
-            <w:r>
-              <w:rPr>
-                <w:rFonts w:ascii="Arial" w:cs="Arial" w:eastAsia="Arial" w:hAnsi="Arial"/>
-                <w:b/>
-                <w:bCs/>
-                <w:highlight w:val="yellow"/>
-                <w:highlightCs w:val="yellow"/>
-              </w:rPr>
-              <w:t xml:space="preserve">[Justificatifs]</w:t>
+              <w:t xml:space="preserve">[CV, attestations, contrat de sous-traitance]</w:t>
             </w:r>
           </w:p>
         </w:tc>
@@ -1159,7 +1239,7 @@
       </w:pPr>
       <w:r>
         <w:rPr>
-          <w:rFonts w:ascii="Arial" w:cs="Arial" w:eastAsia="Arial" w:hAnsi="Arial"/>
+          <w:rFonts w:ascii="Montserrat" w:cs="Montserrat" w:eastAsia="Montserrat" w:hAnsi="Montserrat"/>
         </w:rPr>
         <w:t xml:space="preserve">2. Règles de recrutement et de maintien des compétences</w:t>
       </w:r>
@@ -1175,13 +1255,13 @@
       </w:pPr>
       <w:r>
         <w:rPr>
-          <w:rFonts w:ascii="Arial" w:cs="Arial" w:eastAsia="Arial" w:hAnsi="Arial"/>
+          <w:rFonts w:ascii="Inter" w:cs="Inter" w:eastAsia="Inter" w:hAnsi="Inter"/>
         </w:rPr>
         <w:t xml:space="preserve">Chaque formateur justifie d’une </w:t>
       </w:r>
       <w:r>
         <w:rPr>
-          <w:rFonts w:ascii="Arial" w:cs="Arial" w:eastAsia="Arial" w:hAnsi="Arial"/>
+          <w:rFonts w:ascii="Inter" w:cs="Inter" w:eastAsia="Inter" w:hAnsi="Inter"/>
           <w:b/>
           <w:bCs/>
         </w:rPr>
@@ -1189,7 +1269,7 @@
       </w:r>
       <w:r>
         <w:rPr>
-          <w:rFonts w:ascii="Arial" w:cs="Arial" w:eastAsia="Arial" w:hAnsi="Arial"/>
+          <w:rFonts w:ascii="Inter" w:cs="Inter" w:eastAsia="Inter" w:hAnsi="Inter"/>
         </w:rPr>
         <w:t xml:space="preserve"> et/ou d’un diplôme de niveau au moins égal à celui de la certification préparée.</w:t>
       </w:r>
@@ -1205,25 +1285,9 @@
       </w:pPr>
       <w:r>
         <w:rPr>
-          <w:rFonts w:ascii="Arial" w:cs="Arial" w:eastAsia="Arial" w:hAnsi="Arial"/>
-        </w:rPr>
-        <w:t xml:space="preserve">Pour les titres professionnels du ministère du Travail, l’équipe respecte les exigences fixées par le référentiel de certification et l’arrêté du titre (</w:t>
-      </w:r>
-      <w:r>
-        <w:rPr>
-          <w:rFonts w:ascii="Arial" w:cs="Arial" w:eastAsia="Arial" w:hAnsi="Arial"/>
-          <w:b/>
-          <w:bCs/>
-          <w:highlight w:val="yellow"/>
-          <w:highlightCs w:val="yellow"/>
-        </w:rPr>
-        <w:t xml:space="preserve">[à vérifier pour chaque titre]</w:t>
-      </w:r>
-      <w:r>
-        <w:rPr>
-          <w:rFonts w:ascii="Arial" w:cs="Arial" w:eastAsia="Arial" w:hAnsi="Arial"/>
-        </w:rPr>
-        <w:t xml:space="preserve">).</w:t>
+          <w:rFonts w:ascii="Inter" w:cs="Inter" w:eastAsia="Inter" w:hAnsi="Inter"/>
+        </w:rPr>
+        <w:t xml:space="preserve">Pour le titre professionnel MEM, l’équipe respecte les exigences fixées par le référentiel de certification du titre. Pour le Product Builder No-Code et le Responsable RH, elle respecte les exigences fixées par chaque certificateur dans la convention de partenariat.</w:t>
       </w:r>
     </w:p>
     <w:p>
@@ -1237,23 +1301,37 @@
       </w:pPr>
       <w:r>
         <w:rPr>
-          <w:rFonts w:ascii="Arial" w:cs="Arial" w:eastAsia="Arial" w:hAnsi="Arial"/>
-        </w:rPr>
-        <w:t xml:space="preserve">Chaque formateur suit au moins </w:t>
-      </w:r>
-      <w:r>
-        <w:rPr>
-          <w:rFonts w:ascii="Arial" w:cs="Arial" w:eastAsia="Arial" w:hAnsi="Arial"/>
+          <w:rFonts w:ascii="Inter" w:cs="Inter" w:eastAsia="Inter" w:hAnsi="Inter"/>
+        </w:rPr>
+        <w:t xml:space="preserve">YEBA FORMATIONS compte aujourd’hui un formateur permanent, son dirigeant. Les modules qui demandent une expertise technique pointue (droit du travail et paie, développement sans code) seront confiés à des </w:t>
+      </w:r>
+      <w:r>
+        <w:rPr>
+          <w:rFonts w:ascii="Inter" w:cs="Inter" w:eastAsia="Inter" w:hAnsi="Inter"/>
           <w:b/>
           <w:bCs/>
         </w:rPr>
-        <w:t xml:space="preserve">une action de développement des compétences par an</w:t>
-      </w:r>
-      <w:r>
-        <w:rPr>
-          <w:rFonts w:ascii="Arial" w:cs="Arial" w:eastAsia="Arial" w:hAnsi="Arial"/>
-        </w:rPr>
-        <w:t xml:space="preserve"> (pédagogie, handicap, numérique, métier), tracée dans un plan annuel conformément à l’indicateur 26 du référentiel national qualité.</w:t>
+        <w:t xml:space="preserve">intervenants experts sous contrat de sous-traitance</w:t>
+      </w:r>
+      <w:r>
+        <w:rPr>
+          <w:rFonts w:ascii="Inter" w:cs="Inter" w:eastAsia="Inter" w:hAnsi="Inter"/>
+        </w:rPr>
+        <w:t xml:space="preserve">, recrutés avant le </w:t>
+      </w:r>
+      <w:r>
+        <w:rPr>
+          <w:rFonts w:ascii="Inter" w:cs="Inter" w:eastAsia="Inter" w:hAnsi="Inter"/>
+          <w:b/>
+          <w:bCs/>
+        </w:rPr>
+        <w:t xml:space="preserve">1er mars 2027</w:t>
+      </w:r>
+      <w:r>
+        <w:rPr>
+          <w:rFonts w:ascii="Inter" w:cs="Inter" w:eastAsia="Inter" w:hAnsi="Inter"/>
+        </w:rPr>
+        <w:t xml:space="preserve">. Leur CV et leurs diplômes seront transmis à la DEETS dès la signature des contrats.</w:t>
       </w:r>
     </w:p>
     <w:p>
@@ -1267,21 +1345,51 @@
       </w:pPr>
       <w:r>
         <w:rPr>
-          <w:rFonts w:ascii="Arial" w:cs="Arial" w:eastAsia="Arial" w:hAnsi="Arial"/>
-        </w:rPr>
-        <w:t xml:space="preserve">Les intervenants extérieurs signent une </w:t>
-      </w:r>
-      <w:r>
-        <w:rPr>
-          <w:rFonts w:ascii="Arial" w:cs="Arial" w:eastAsia="Arial" w:hAnsi="Arial"/>
+          <w:rFonts w:ascii="Inter" w:cs="Inter" w:eastAsia="Inter" w:hAnsi="Inter"/>
+        </w:rPr>
+        <w:t xml:space="preserve">Chaque formateur suit au moins </w:t>
+      </w:r>
+      <w:r>
+        <w:rPr>
+          <w:rFonts w:ascii="Inter" w:cs="Inter" w:eastAsia="Inter" w:hAnsi="Inter"/>
           <w:b/>
           <w:bCs/>
         </w:rPr>
+        <w:t xml:space="preserve">une action de développement des compétences par an</w:t>
+      </w:r>
+      <w:r>
+        <w:rPr>
+          <w:rFonts w:ascii="Inter" w:cs="Inter" w:eastAsia="Inter" w:hAnsi="Inter"/>
+        </w:rPr>
+        <w:t xml:space="preserve"> (pédagogie, handicap, numérique, métier), tracée dans un plan annuel conformément à l’indicateur 26 du référentiel national qualité.</w:t>
+      </w:r>
+    </w:p>
+    <w:p>
+      <w:pPr>
+        <w:pStyle w:val="ListParagraph"/>
+        <w:numPr>
+          <w:ilvl w:val="0"/>
+          <w:numId w:val="2"/>
+        </w:numPr>
+        <w:spacing w:after="60" w:line="276"/>
+      </w:pPr>
+      <w:r>
+        <w:rPr>
+          <w:rFonts w:ascii="Inter" w:cs="Inter" w:eastAsia="Inter" w:hAnsi="Inter"/>
+        </w:rPr>
+        <w:t xml:space="preserve">Les intervenants extérieurs signent une </w:t>
+      </w:r>
+      <w:r>
+        <w:rPr>
+          <w:rFonts w:ascii="Inter" w:cs="Inter" w:eastAsia="Inter" w:hAnsi="Inter"/>
+          <w:b/>
+          <w:bCs/>
+        </w:rPr>
         <w:t xml:space="preserve">charte de l’intervenant</w:t>
       </w:r>
       <w:r>
         <w:rPr>
-          <w:rFonts w:ascii="Arial" w:cs="Arial" w:eastAsia="Arial" w:hAnsi="Arial"/>
+          <w:rFonts w:ascii="Inter" w:cs="Inter" w:eastAsia="Inter" w:hAnsi="Inter"/>
         </w:rPr>
         <w:t xml:space="preserve"> (posture, égalité, confidentialité, RGPD).</w:t>
       </w:r>
@@ -1291,7 +1399,7 @@
         <w:tblW w:type="dxa" w:w="9638"/>
         <w:tblBorders>
           <w:top w:val="none" w:color="FFFFFF" w:sz="0"/>
-          <w:left w:val="single" w:color="1F3A5F" w:sz="12"/>
+          <w:left w:val="single" w:color="1B3A6B" w:sz="12"/>
           <w:bottom w:val="none" w:color="FFFFFF" w:sz="0"/>
           <w:right w:val="none" w:color="FFFFFF" w:sz="0"/>
           <w:insideH w:val="none" w:color="FFFFFF" w:sz="0"/>
@@ -1305,7 +1413,7 @@
         <w:tc>
           <w:tcPr>
             <w:tcW w:type="dxa" w:w="9638"/>
-            <w:shd w:fill="EAF0F6" w:color="auto" w:val="clear"/>
+            <w:shd w:fill="EEF1F6" w:color="auto" w:val="clear"/>
             <w:tcMar>
               <w:top w:type="dxa" w:w="100"/>
               <w:left w:type="dxa" w:w="160"/>
@@ -1319,10 +1427,10 @@
             </w:pPr>
             <w:r>
               <w:rPr>
-                <w:rFonts w:ascii="Arial" w:cs="Arial" w:eastAsia="Arial" w:hAnsi="Arial"/>
+                <w:rFonts w:ascii="Montserrat" w:cs="Montserrat" w:eastAsia="Montserrat" w:hAnsi="Montserrat"/>
                 <w:b/>
                 <w:bCs/>
-                <w:color w:val="1F3A5F"/>
+                <w:color w:val="1B3A6B"/>
               </w:rPr>
               <w:t xml:space="preserve">Conformité RGPD / IA Act</w:t>
             </w:r>
@@ -1333,7 +1441,7 @@
             </w:pPr>
             <w:r>
               <w:rPr>
-                <w:rFonts w:ascii="Arial" w:cs="Arial" w:eastAsia="Arial" w:hAnsi="Arial"/>
+                <w:rFonts w:ascii="Inter" w:cs="Inter" w:eastAsia="Inter" w:hAnsi="Inter"/>
                 <w:b/>
                 <w:bCs/>
               </w:rPr>
@@ -1341,13 +1449,13 @@
             </w:r>
             <w:r>
               <w:rPr>
-                <w:rFonts w:ascii="Arial" w:cs="Arial" w:eastAsia="Arial" w:hAnsi="Arial"/>
+                <w:rFonts w:ascii="Inter" w:cs="Inter" w:eastAsia="Inter" w:hAnsi="Inter"/>
               </w:rPr>
               <w:t xml:space="preserve"> — Les CV et diplômes des formateurs sont des données personnelles : ils ne sont transmis à la DEETS qu’aux fins de l’instruction, avec information préalable des intéressés. Conservation limitée à la durée de la collaboration augmentée des délais de contrôle (</w:t>
             </w:r>
             <w:r>
               <w:rPr>
-                <w:rFonts w:ascii="Arial" w:cs="Arial" w:eastAsia="Arial" w:hAnsi="Arial"/>
+                <w:rFonts w:ascii="Inter" w:cs="Inter" w:eastAsia="Inter" w:hAnsi="Inter"/>
                 <w:b/>
                 <w:bCs/>
                 <w:highlight w:val="yellow"/>
@@ -1357,7 +1465,7 @@
             </w:r>
             <w:r>
               <w:rPr>
-                <w:rFonts w:ascii="Arial" w:cs="Arial" w:eastAsia="Arial" w:hAnsi="Arial"/>
+                <w:rFonts w:ascii="Inter" w:cs="Inter" w:eastAsia="Inter" w:hAnsi="Inter"/>
               </w:rPr>
               <w:t xml:space="preserve">).</w:t>
             </w:r>
@@ -1382,41 +1490,39 @@
       </w:pPr>
       <w:r>
         <w:rPr>
-          <w:rFonts w:ascii="Arial" w:cs="Arial" w:eastAsia="Arial" w:hAnsi="Arial"/>
-        </w:rPr>
-        <w:t xml:space="preserve">Fait à </w:t>
-      </w:r>
-      <w:r>
-        <w:rPr>
-          <w:rFonts w:ascii="Arial" w:cs="Arial" w:eastAsia="Arial" w:hAnsi="Arial"/>
+          <w:rFonts w:ascii="Inter" w:cs="Inter" w:eastAsia="Inter" w:hAnsi="Inter"/>
+        </w:rPr>
+        <w:t xml:space="preserve">Fait à Saint-Denis, le </w:t>
+      </w:r>
+      <w:r>
+        <w:rPr>
+          <w:rFonts w:ascii="Inter" w:cs="Inter" w:eastAsia="Inter" w:hAnsi="Inter"/>
           <w:b/>
           <w:bCs/>
           <w:highlight w:val="yellow"/>
           <w:highlightCs w:val="yellow"/>
         </w:rPr>
-        <w:t xml:space="preserve">[commune]</w:t>
-      </w:r>
-      <w:r>
-        <w:rPr>
-          <w:rFonts w:ascii="Arial" w:cs="Arial" w:eastAsia="Arial" w:hAnsi="Arial"/>
-        </w:rPr>
-        <w:t xml:space="preserve">, le </w:t>
-      </w:r>
-      <w:r>
-        <w:rPr>
-          <w:rFonts w:ascii="Arial" w:cs="Arial" w:eastAsia="Arial" w:hAnsi="Arial"/>
+        <w:t xml:space="preserve">[date d’envoi]</w:t>
+      </w:r>
+      <w:r>
+        <w:rPr>
+          <w:rFonts w:ascii="Inter" w:cs="Inter" w:eastAsia="Inter" w:hAnsi="Inter"/>
+        </w:rPr>
+        <w:t xml:space="preserve">.</w:t>
+      </w:r>
+    </w:p>
+    <w:p>
+      <w:pPr>
+        <w:spacing w:after="120" w:line="288"/>
+        <w:jc w:val="left"/>
+      </w:pPr>
+      <w:r>
+        <w:rPr>
+          <w:rFonts w:ascii="Inter" w:cs="Inter" w:eastAsia="Inter" w:hAnsi="Inter"/>
           <w:b/>
           <w:bCs/>
-          <w:highlight w:val="yellow"/>
-          <w:highlightCs w:val="yellow"/>
-        </w:rPr>
-        <w:t xml:space="preserve">[date d’envoi]</w:t>
-      </w:r>
-      <w:r>
-        <w:rPr>
-          <w:rFonts w:ascii="Arial" w:cs="Arial" w:eastAsia="Arial" w:hAnsi="Arial"/>
-        </w:rPr>
-        <w:t xml:space="preserve">.</w:t>
+        </w:rPr>
+        <w:t xml:space="preserve">Aurélien LUMEKA, Directeur de YEBA FORMATIONS</w:t>
       </w:r>
     </w:p>
     <w:p>
@@ -1426,21 +1532,7 @@
       </w:pPr>
       <w:r>
         <w:rPr>
-          <w:rFonts w:ascii="Arial" w:cs="Arial" w:eastAsia="Arial" w:hAnsi="Arial"/>
-          <w:b/>
-          <w:bCs/>
-        </w:rPr>
-        <w:t xml:space="preserve">Aurélien LUMEKA, Directeur de YEBA FORMATIONS</w:t>
-      </w:r>
-    </w:p>
-    <w:p>
-      <w:pPr>
-        <w:spacing w:after="120" w:line="288"/>
-        <w:jc w:val="left"/>
-      </w:pPr>
-      <w:r>
-        <w:rPr>
-          <w:rFonts w:ascii="Arial" w:cs="Arial" w:eastAsia="Arial" w:hAnsi="Arial"/>
+          <w:rFonts w:ascii="Inter" w:cs="Inter" w:eastAsia="Inter" w:hAnsi="Inter"/>
         </w:rPr>
         <w:t xml:space="preserve">Signature et cachet :</w:t>
       </w:r>
@@ -1506,8 +1598,8 @@
     </w:pPr>
     <w:r>
       <w:rPr>
-        <w:rFonts w:ascii="Arial" w:cs="Arial" w:eastAsia="Arial" w:hAnsi="Arial"/>
-        <w:color w:val="595959"/>
+        <w:rFonts w:ascii="Inter" w:cs="Inter" w:eastAsia="Inter" w:hAnsi="Inter"/>
+        <w:color w:val="4D4D4D"/>
         <w:sz w:val="16"/>
         <w:szCs w:val="16"/>
       </w:rPr>
@@ -1515,8 +1607,8 @@
     </w:r>
     <w:r>
       <w:rPr>
-        <w:rFonts w:ascii="Arial" w:cs="Arial" w:eastAsia="Arial" w:hAnsi="Arial"/>
-        <w:color w:val="595959"/>
+        <w:rFonts w:ascii="Inter" w:cs="Inter" w:eastAsia="Inter" w:hAnsi="Inter"/>
+        <w:color w:val="4D4D4D"/>
         <w:sz w:val="16"/>
         <w:szCs w:val="16"/>
       </w:rPr>
@@ -1527,8 +1619,8 @@
     </w:r>
     <w:r>
       <w:rPr>
-        <w:rFonts w:ascii="Arial" w:cs="Arial" w:eastAsia="Arial" w:hAnsi="Arial"/>
-        <w:color w:val="595959"/>
+        <w:rFonts w:ascii="Inter" w:cs="Inter" w:eastAsia="Inter" w:hAnsi="Inter"/>
+        <w:color w:val="4D4D4D"/>
         <w:sz w:val="16"/>
         <w:szCs w:val="16"/>
       </w:rPr>
@@ -1536,8 +1628,8 @@
     </w:r>
     <w:r>
       <w:rPr>
-        <w:rFonts w:ascii="Arial" w:cs="Arial" w:eastAsia="Arial" w:hAnsi="Arial"/>
-        <w:color w:val="595959"/>
+        <w:rFonts w:ascii="Inter" w:cs="Inter" w:eastAsia="Inter" w:hAnsi="Inter"/>
+        <w:color w:val="4D4D4D"/>
         <w:sz w:val="16"/>
         <w:szCs w:val="16"/>
       </w:rPr>
@@ -1595,8 +1687,8 @@
     </w:pPr>
     <w:r>
       <w:rPr>
-        <w:rFonts w:ascii="Arial" w:cs="Arial" w:eastAsia="Arial" w:hAnsi="Arial"/>
-        <w:color w:val="595959"/>
+        <w:rFonts w:ascii="Inter" w:cs="Inter" w:eastAsia="Inter" w:hAnsi="Inter"/>
+        <w:color w:val="4D4D4D"/>
         <w:sz w:val="16"/>
         <w:szCs w:val="16"/>
       </w:rPr>
@@ -1733,7 +1825,8 @@
   <w:docDefaults>
     <w:rPrDefault>
       <w:rPr>
-        <w:rFonts w:ascii="Arial" w:cs="Arial" w:eastAsia="Arial" w:hAnsi="Arial"/>
+        <w:rFonts w:ascii="Inter" w:cs="Inter" w:eastAsia="Inter" w:hAnsi="Inter"/>
+        <w:color w:val="121212"/>
         <w:sz w:val="22"/>
         <w:szCs w:val="22"/>
       </w:rPr>
@@ -1917,13 +2010,16 @@
     <w:next w:val="Normal"/>
     <w:qFormat/>
     <w:pPr>
+      <w:pBdr>
+        <w:bottom w:val="single" w:color="C9AB4C" w:sz="8" w:space="4"/>
+      </w:pBdr>
       <w:outlineLvl w:val="0"/>
     </w:pPr>
     <w:rPr>
-      <w:rFonts w:ascii="Arial" w:cs="Arial" w:eastAsia="Arial" w:hAnsi="Arial"/>
+      <w:rFonts w:ascii="Montserrat" w:cs="Montserrat" w:eastAsia="Montserrat" w:hAnsi="Montserrat"/>
       <w:b/>
       <w:bCs/>
-      <w:color w:val="1F3A5F"/>
+      <w:color w:val="1B3A6B"/>
       <w:sz w:val="28"/>
       <w:szCs w:val="28"/>
     </w:rPr>
@@ -1937,10 +2033,10 @@
       <w:outlineLvl w:val="1"/>
     </w:pPr>
     <w:rPr>
-      <w:rFonts w:ascii="Arial" w:cs="Arial" w:eastAsia="Arial" w:hAnsi="Arial"/>
+      <w:rFonts w:ascii="Montserrat" w:cs="Montserrat" w:eastAsia="Montserrat" w:hAnsi="Montserrat"/>
       <w:b/>
       <w:bCs/>
-      <w:color w:val="C8691C"/>
+      <w:color w:val="1B3A6B"/>
       <w:sz w:val="24"/>
       <w:szCs w:val="24"/>
     </w:rPr>

</xml_diff>

<commit_message>
Dossier DEETS v3 : périmètre MEM seul, Rendez-vous du mois, planning annuel, PDF et ZIP d'envoi
Co-Authored-By: Claude Opus 5.5 <noreply@anthropic.com>
Claude-Session: https://claude.ai/code/session_01XmXRuHREkUhS4BvVjcPE7t
</commit_message>
<xml_diff>
--- a/dossier-deets-apprentissage/word/04_Equipe_pedagogique_titres_et_qualites.docx
+++ b/dossier-deets-apprentissage/word/04_Equipe_pedagogique_titres_et_qualites.docx
@@ -113,6 +113,7 @@
           <w:p>
             <w:pPr>
               <w:spacing w:after="40"/>
+              <w:jc w:val="left"/>
             </w:pPr>
             <w:r>
               <w:rPr>
@@ -139,6 +140,7 @@
           <w:p>
             <w:pPr>
               <w:spacing w:after="40"/>
+              <w:jc w:val="left"/>
             </w:pPr>
             <w:r>
               <w:rPr>
@@ -169,6 +171,7 @@
           <w:p>
             <w:pPr>
               <w:spacing w:after="40"/>
+              <w:jc w:val="left"/>
             </w:pPr>
             <w:r>
               <w:rPr>
@@ -191,6 +194,7 @@
           <w:p>
             <w:pPr>
               <w:spacing w:after="40"/>
+              <w:jc w:val="left"/>
             </w:pPr>
             <w:r>
               <w:rPr>
@@ -219,6 +223,7 @@
           <w:p>
             <w:pPr>
               <w:spacing w:after="40"/>
+              <w:jc w:val="left"/>
             </w:pPr>
             <w:r>
               <w:rPr>
@@ -242,6 +247,7 @@
           <w:p>
             <w:pPr>
               <w:spacing w:after="40"/>
+              <w:jc w:val="left"/>
             </w:pPr>
             <w:r>
               <w:rPr>
@@ -269,6 +275,7 @@
           <w:p>
             <w:pPr>
               <w:spacing w:after="40"/>
+              <w:jc w:val="left"/>
             </w:pPr>
             <w:r>
               <w:rPr>
@@ -291,12 +298,13 @@
           <w:p>
             <w:pPr>
               <w:spacing w:after="40"/>
-            </w:pPr>
-            <w:r>
-              <w:rPr>
-                <w:rFonts w:ascii="Inter" w:cs="Inter" w:eastAsia="Inter" w:hAnsi="Inter"/>
-              </w:rPr>
-              <w:t xml:space="preserve">Présentation des personnes intervenant en qualité de formateur ; les diplômes, certificats et CV sont joints en annexe.</w:t>
+              <w:jc w:val="both"/>
+            </w:pPr>
+            <w:r>
+              <w:rPr>
+                <w:rFonts w:ascii="Inter" w:cs="Inter" w:eastAsia="Inter" w:hAnsi="Inter"/>
+              </w:rPr>
+              <w:t xml:space="preserve">Présentation des personnes intervenant en qualité de formateur auprès des apprentis préparant le titre professionnel Manager d’établissement marchand (MEM) ; les diplômes, certificats et CV sont joints en annexe.</w:t>
             </w:r>
           </w:p>
         </w:tc>
@@ -319,6 +327,7 @@
           <w:p>
             <w:pPr>
               <w:spacing w:after="40"/>
+              <w:jc w:val="left"/>
             </w:pPr>
             <w:r>
               <w:rPr>
@@ -342,6 +351,7 @@
           <w:p>
             <w:pPr>
               <w:spacing w:after="40"/>
+              <w:jc w:val="left"/>
             </w:pPr>
             <w:r>
               <w:rPr>
@@ -369,6 +379,7 @@
           <w:p>
             <w:pPr>
               <w:spacing w:after="40"/>
+              <w:jc w:val="left"/>
             </w:pPr>
             <w:r>
               <w:rPr>
@@ -391,6 +402,7 @@
           <w:p>
             <w:pPr>
               <w:spacing w:after="40"/>
+              <w:jc w:val="left"/>
             </w:pPr>
             <w:r>
               <w:rPr>
@@ -419,6 +431,7 @@
           <w:p>
             <w:pPr>
               <w:spacing w:after="40"/>
+              <w:jc w:val="left"/>
             </w:pPr>
             <w:r>
               <w:rPr>
@@ -442,6 +455,7 @@
           <w:p>
             <w:pPr>
               <w:spacing w:after="40"/>
+              <w:jc w:val="both"/>
             </w:pPr>
             <w:r>
               <w:rPr>
@@ -469,6 +483,7 @@
           <w:p>
             <w:pPr>
               <w:spacing w:after="40"/>
+              <w:jc w:val="left"/>
             </w:pPr>
             <w:r>
               <w:rPr>
@@ -491,6 +506,7 @@
           <w:p>
             <w:pPr>
               <w:spacing w:after="40"/>
+              <w:jc w:val="left"/>
             </w:pPr>
             <w:r>
               <w:rPr>
@@ -519,6 +535,7 @@
           <w:p>
             <w:pPr>
               <w:spacing w:after="40"/>
+              <w:jc w:val="left"/>
             </w:pPr>
             <w:r>
               <w:rPr>
@@ -542,6 +559,7 @@
           <w:p>
             <w:pPr>
               <w:spacing w:after="40"/>
+              <w:jc w:val="left"/>
             </w:pPr>
             <w:r>
               <w:rPr>
@@ -568,7 +586,7 @@
         <w:rPr>
           <w:rFonts w:ascii="Montserrat" w:cs="Montserrat" w:eastAsia="Montserrat" w:hAnsi="Montserrat"/>
         </w:rPr>
-        <w:t xml:space="preserve">1. Équipe pédagogique de la première promotion</w:t>
+        <w:t xml:space="preserve">1. Équipe pédagogique de la promotion MEM 2027-2028</w:t>
       </w:r>
     </w:p>
     <w:p>
@@ -580,7 +598,21 @@
         <w:rPr>
           <w:rFonts w:ascii="Inter" w:cs="Inter" w:eastAsia="Inter" w:hAnsi="Inter"/>
         </w:rPr>
-        <w:t xml:space="preserve">Le tableau ci-dessous recense les intervenants pressentis. Chaque ligne renvoie à un justificatif joint (CV daté et signé, copie des diplômes et certificats).</w:t>
+        <w:t xml:space="preserve">YEBA FORMATIONS ouvre en mars 2027 une seule formation par apprentissage : le </w:t>
+      </w:r>
+      <w:r>
+        <w:rPr>
+          <w:rFonts w:ascii="Inter" w:cs="Inter" w:eastAsia="Inter" w:hAnsi="Inter"/>
+          <w:b/>
+          <w:bCs/>
+        </w:rPr>
+        <w:t xml:space="preserve">titre professionnel Manager d’établissement marchand</w:t>
+      </w:r>
+      <w:r>
+        <w:rPr>
+          <w:rFonts w:ascii="Inter" w:cs="Inter" w:eastAsia="Inter" w:hAnsi="Inter"/>
+        </w:rPr>
+        <w:t xml:space="preserve"> (RNCP 41853, niveau 5), pour un groupe de 8 à 10 apprentis. Ce titre relève directement du domaine d’expertise de son dirigeant : le management d’équipe, la vente et la relation client.</w:t>
       </w:r>
     </w:p>
     <w:tbl>
@@ -599,9 +631,9 @@
       <w:tblGrid>
         <w:gridCol w:w="1700"/>
         <w:gridCol w:w="1500"/>
-        <w:gridCol w:w="3200"/>
-        <w:gridCol w:w="1800"/>
-        <w:gridCol w:w="1438"/>
+        <w:gridCol w:w="3100"/>
+        <w:gridCol w:w="2000"/>
+        <w:gridCol w:w="1338"/>
       </w:tblGrid>
       <w:tr>
         <w:trPr>
@@ -621,6 +653,7 @@
           <w:p>
             <w:pPr>
               <w:spacing w:after="40"/>
+              <w:jc w:val="left"/>
             </w:pPr>
             <w:r>
               <w:rPr>
@@ -647,6 +680,7 @@
           <w:p>
             <w:pPr>
               <w:spacing w:after="40"/>
+              <w:jc w:val="left"/>
             </w:pPr>
             <w:r>
               <w:rPr>
@@ -661,7 +695,7 @@
         </w:tc>
         <w:tc>
           <w:tcPr>
-            <w:tcW w:type="dxa" w:w="3200"/>
+            <w:tcW w:type="dxa" w:w="3100"/>
             <w:shd w:fill="1B3A6B" w:color="auto" w:val="clear"/>
             <w:tcMar>
               <w:top w:type="dxa" w:w="60"/>
@@ -673,6 +707,7 @@
           <w:p>
             <w:pPr>
               <w:spacing w:after="40"/>
+              <w:jc w:val="left"/>
             </w:pPr>
             <w:r>
               <w:rPr>
@@ -687,7 +722,7 @@
         </w:tc>
         <w:tc>
           <w:tcPr>
-            <w:tcW w:type="dxa" w:w="1800"/>
+            <w:tcW w:type="dxa" w:w="2000"/>
             <w:shd w:fill="1B3A6B" w:color="auto" w:val="clear"/>
             <w:tcMar>
               <w:top w:type="dxa" w:w="60"/>
@@ -699,6 +734,7 @@
           <w:p>
             <w:pPr>
               <w:spacing w:after="40"/>
+              <w:jc w:val="left"/>
             </w:pPr>
             <w:r>
               <w:rPr>
@@ -713,7 +749,7 @@
         </w:tc>
         <w:tc>
           <w:tcPr>
-            <w:tcW w:type="dxa" w:w="1438"/>
+            <w:tcW w:type="dxa" w:w="1338"/>
             <w:shd w:fill="1B3A6B" w:color="auto" w:val="clear"/>
             <w:tcMar>
               <w:top w:type="dxa" w:w="60"/>
@@ -725,6 +761,7 @@
           <w:p>
             <w:pPr>
               <w:spacing w:after="40"/>
+              <w:jc w:val="left"/>
             </w:pPr>
             <w:r>
               <w:rPr>
@@ -755,6 +792,7 @@
           <w:p>
             <w:pPr>
               <w:spacing w:after="40"/>
+              <w:jc w:val="left"/>
             </w:pPr>
             <w:r>
               <w:rPr>
@@ -777,6 +815,7 @@
           <w:p>
             <w:pPr>
               <w:spacing w:after="40"/>
+              <w:jc w:val="left"/>
             </w:pPr>
             <w:r>
               <w:rPr>
@@ -788,17 +827,18 @@
         </w:tc>
         <w:tc>
           <w:tcPr>
-            <w:tcW w:type="dxa" w:w="3200"/>
-            <w:tcMar>
-              <w:top w:type="dxa" w:w="60"/>
-              <w:left w:type="dxa" w:w="90"/>
-              <w:bottom w:type="dxa" w:w="60"/>
-              <w:right w:type="dxa" w:w="90"/>
-            </w:tcMar>
-          </w:tcPr>
-          <w:p>
-            <w:pPr>
-              <w:spacing w:after="40"/>
+            <w:tcW w:type="dxa" w:w="3100"/>
+            <w:tcMar>
+              <w:top w:type="dxa" w:w="60"/>
+              <w:left w:type="dxa" w:w="90"/>
+              <w:bottom w:type="dxa" w:w="60"/>
+              <w:right w:type="dxa" w:w="90"/>
+            </w:tcMar>
+          </w:tcPr>
+          <w:p>
+            <w:pPr>
+              <w:spacing w:after="40"/>
+              <w:jc w:val="left"/>
             </w:pPr>
             <w:r>
               <w:rPr>
@@ -810,6 +850,7 @@
           <w:p>
             <w:pPr>
               <w:spacing w:after="40"/>
+              <w:jc w:val="left"/>
             </w:pPr>
             <w:r>
               <w:rPr>
@@ -821,6 +862,7 @@
           <w:p>
             <w:pPr>
               <w:spacing w:after="40"/>
+              <w:jc w:val="left"/>
             </w:pPr>
             <w:r>
               <w:rPr>
@@ -832,6 +874,7 @@
           <w:p>
             <w:pPr>
               <w:spacing w:after="40"/>
+              <w:jc w:val="left"/>
             </w:pPr>
             <w:r>
               <w:rPr>
@@ -843,6 +886,7 @@
           <w:p>
             <w:pPr>
               <w:spacing w:after="40"/>
+              <w:jc w:val="left"/>
             </w:pPr>
             <w:r>
               <w:rPr>
@@ -854,6 +898,7 @@
           <w:p>
             <w:pPr>
               <w:spacing w:after="40"/>
+              <w:jc w:val="left"/>
             </w:pPr>
             <w:r>
               <w:rPr>
@@ -865,6 +910,7 @@
           <w:p>
             <w:pPr>
               <w:spacing w:after="40"/>
+              <w:jc w:val="left"/>
             </w:pPr>
             <w:r>
               <w:rPr>
@@ -880,72 +926,77 @@
         </w:tc>
         <w:tc>
           <w:tcPr>
-            <w:tcW w:type="dxa" w:w="1800"/>
-            <w:tcMar>
-              <w:top w:type="dxa" w:w="60"/>
-              <w:left w:type="dxa" w:w="90"/>
-              <w:bottom w:type="dxa" w:w="60"/>
-              <w:right w:type="dxa" w:w="90"/>
-            </w:tcMar>
-          </w:tcPr>
-          <w:p>
-            <w:pPr>
-              <w:spacing w:after="40"/>
-            </w:pPr>
-            <w:r>
-              <w:rPr>
-                <w:rFonts w:ascii="Inter" w:cs="Inter" w:eastAsia="Inter" w:hAnsi="Inter"/>
-              </w:rPr>
-              <w:t xml:space="preserve">MEM : CCP 1, 2 et 3</w:t>
-            </w:r>
-          </w:p>
-          <w:p>
-            <w:pPr>
-              <w:spacing w:after="40"/>
-            </w:pPr>
-            <w:r>
-              <w:rPr>
-                <w:rFonts w:ascii="Inter" w:cs="Inter" w:eastAsia="Inter" w:hAnsi="Inter"/>
-              </w:rPr>
-              <w:t xml:space="preserve">Product Builder : gestion de projet, automatisation, données, RGPD et IA Act</w:t>
-            </w:r>
-          </w:p>
-          <w:p>
-            <w:pPr>
-              <w:spacing w:after="40"/>
-            </w:pPr>
-            <w:r>
-              <w:rPr>
-                <w:rFonts w:ascii="Inter" w:cs="Inter" w:eastAsia="Inter" w:hAnsi="Inter"/>
-              </w:rPr>
-              <w:t xml:space="preserve">Responsable RH : management, communication, RGPD et IA</w:t>
-            </w:r>
-          </w:p>
-          <w:p>
-            <w:pPr>
-              <w:spacing w:after="40"/>
-            </w:pPr>
-            <w:r>
-              <w:rPr>
-                <w:rFonts w:ascii="Inter" w:cs="Inter" w:eastAsia="Inter" w:hAnsi="Inter"/>
-              </w:rPr>
-              <w:t xml:space="preserve">Modules transverses</w:t>
-            </w:r>
-          </w:p>
-        </w:tc>
-        <w:tc>
-          <w:tcPr>
-            <w:tcW w:type="dxa" w:w="1438"/>
-            <w:tcMar>
-              <w:top w:type="dxa" w:w="60"/>
-              <w:left w:type="dxa" w:w="90"/>
-              <w:bottom w:type="dxa" w:w="60"/>
-              <w:right w:type="dxa" w:w="90"/>
-            </w:tcMar>
-          </w:tcPr>
-          <w:p>
-            <w:pPr>
-              <w:spacing w:after="40"/>
+            <w:tcW w:type="dxa" w:w="2000"/>
+            <w:tcMar>
+              <w:top w:type="dxa" w:w="60"/>
+              <w:left w:type="dxa" w:w="90"/>
+              <w:bottom w:type="dxa" w:w="60"/>
+              <w:right w:type="dxa" w:w="90"/>
+            </w:tcMar>
+          </w:tcPr>
+          <w:p>
+            <w:pPr>
+              <w:spacing w:after="40"/>
+              <w:jc w:val="left"/>
+            </w:pPr>
+            <w:r>
+              <w:rPr>
+                <w:rFonts w:ascii="Inter" w:cs="Inter" w:eastAsia="Inter" w:hAnsi="Inter"/>
+              </w:rPr>
+              <w:t xml:space="preserve">CCP 1 — Manager l’équipe de son périmètre</w:t>
+            </w:r>
+          </w:p>
+          <w:p>
+            <w:pPr>
+              <w:spacing w:after="40"/>
+              <w:jc w:val="left"/>
+            </w:pPr>
+            <w:r>
+              <w:rPr>
+                <w:rFonts w:ascii="Inter" w:cs="Inter" w:eastAsia="Inter" w:hAnsi="Inter"/>
+              </w:rPr>
+              <w:t xml:space="preserve">CCP 2 — Développer la dynamique commerciale de son périmètre</w:t>
+            </w:r>
+          </w:p>
+          <w:p>
+            <w:pPr>
+              <w:spacing w:after="40"/>
+              <w:jc w:val="left"/>
+            </w:pPr>
+            <w:r>
+              <w:rPr>
+                <w:rFonts w:ascii="Inter" w:cs="Inter" w:eastAsia="Inter" w:hAnsi="Inter"/>
+              </w:rPr>
+              <w:t xml:space="preserve">CCP 3 — Contribuer à la performance commerciale et à la rentabilité de son périmètre</w:t>
+            </w:r>
+          </w:p>
+          <w:p>
+            <w:pPr>
+              <w:spacing w:after="40"/>
+              <w:jc w:val="left"/>
+            </w:pPr>
+            <w:r>
+              <w:rPr>
+                <w:rFonts w:ascii="Inter" w:cs="Inter" w:eastAsia="Inter" w:hAnsi="Inter"/>
+              </w:rPr>
+              <w:t xml:space="preserve">Modules transverses (intégration, numérique et IA, insertion)</w:t>
+            </w:r>
+          </w:p>
+        </w:tc>
+        <w:tc>
+          <w:tcPr>
+            <w:tcW w:type="dxa" w:w="1338"/>
+            <w:tcMar>
+              <w:top w:type="dxa" w:w="60"/>
+              <w:left w:type="dxa" w:w="90"/>
+              <w:bottom w:type="dxa" w:w="60"/>
+              <w:right w:type="dxa" w:w="90"/>
+            </w:tcMar>
+          </w:tcPr>
+          <w:p>
+            <w:pPr>
+              <w:spacing w:after="40"/>
+              <w:jc w:val="left"/>
             </w:pPr>
             <w:r>
               <w:rPr>
@@ -984,6 +1035,7 @@
           <w:p>
             <w:pPr>
               <w:spacing w:after="40"/>
+              <w:jc w:val="left"/>
             </w:pPr>
             <w:r>
               <w:rPr>
@@ -993,7 +1045,7 @@
                 <w:highlight w:val="yellow"/>
                 <w:highlightCs w:val="yellow"/>
               </w:rPr>
-              <w:t xml:space="preserve">[Intervenant expert RH à identifier]</w:t>
+              <w:t xml:space="preserve">[Intervenant(e) expert(e) en gestion et rentabilité d’un point de vente, à identifier]</w:t>
             </w:r>
           </w:p>
         </w:tc>
@@ -1011,18 +1063,19 @@
           <w:p>
             <w:pPr>
               <w:spacing w:after="40"/>
-            </w:pPr>
-            <w:r>
-              <w:rPr>
-                <w:rFonts w:ascii="Inter" w:cs="Inter" w:eastAsia="Inter" w:hAnsi="Inter"/>
-              </w:rPr>
-              <w:t xml:space="preserve">Sous-traitant (à contractualiser)</w:t>
-            </w:r>
-          </w:p>
-        </w:tc>
-        <w:tc>
-          <w:tcPr>
-            <w:tcW w:type="dxa" w:w="3200"/>
+              <w:jc w:val="left"/>
+            </w:pPr>
+            <w:r>
+              <w:rPr>
+                <w:rFonts w:ascii="Inter" w:cs="Inter" w:eastAsia="Inter" w:hAnsi="Inter"/>
+              </w:rPr>
+              <w:t xml:space="preserve">Sous-traitant (à contractualiser avant le 01/03/2027)</w:t>
+            </w:r>
+          </w:p>
+        </w:tc>
+        <w:tc>
+          <w:tcPr>
+            <w:tcW w:type="dxa" w:w="3100"/>
             <w:shd w:fill="EEF1F6" w:color="auto" w:val="clear"/>
             <w:tcMar>
               <w:top w:type="dxa" w:w="60"/>
@@ -1034,6 +1087,7 @@
           <w:p>
             <w:pPr>
               <w:spacing w:after="40"/>
+              <w:jc w:val="left"/>
             </w:pPr>
             <w:r>
               <w:rPr>
@@ -1043,13 +1097,13 @@
                 <w:highlight w:val="yellow"/>
                 <w:highlightCs w:val="yellow"/>
               </w:rPr>
-              <w:t xml:space="preserve">[Diplôme RH de niveau 6 ou 7 et expérience de responsable RH]</w:t>
-            </w:r>
-          </w:p>
-        </w:tc>
-        <w:tc>
-          <w:tcPr>
-            <w:tcW w:type="dxa" w:w="1800"/>
+              <w:t xml:space="preserve">[Expérience de direction de magasin ou de contrôle de gestion dans la distribution]</w:t>
+            </w:r>
+          </w:p>
+        </w:tc>
+        <w:tc>
+          <w:tcPr>
+            <w:tcW w:type="dxa" w:w="2000"/>
             <w:shd w:fill="EEF1F6" w:color="auto" w:val="clear"/>
             <w:tcMar>
               <w:top w:type="dxa" w:w="60"/>
@@ -1061,18 +1115,19 @@
           <w:p>
             <w:pPr>
               <w:spacing w:after="40"/>
-            </w:pPr>
-            <w:r>
-              <w:rPr>
-                <w:rFonts w:ascii="Inter" w:cs="Inter" w:eastAsia="Inter" w:hAnsi="Inter"/>
-              </w:rPr>
-              <w:t xml:space="preserve">Responsable RH : droit du travail, paie, GEPP</w:t>
-            </w:r>
-          </w:p>
-        </w:tc>
-        <w:tc>
-          <w:tcPr>
-            <w:tcW w:type="dxa" w:w="1438"/>
+              <w:jc w:val="left"/>
+            </w:pPr>
+            <w:r>
+              <w:rPr>
+                <w:rFonts w:ascii="Inter" w:cs="Inter" w:eastAsia="Inter" w:hAnsi="Inter"/>
+              </w:rPr>
+              <w:t xml:space="preserve">Appui sur le CCP 3 : comptes d’exploitation, indicateurs, gestion des stocks</w:t>
+            </w:r>
+          </w:p>
+        </w:tc>
+        <w:tc>
+          <w:tcPr>
+            <w:tcW w:type="dxa" w:w="1338"/>
             <w:shd w:fill="EEF1F6" w:color="auto" w:val="clear"/>
             <w:tcMar>
               <w:top w:type="dxa" w:w="60"/>
@@ -1084,6 +1139,7 @@
           <w:p>
             <w:pPr>
               <w:spacing w:after="40"/>
+              <w:jc w:val="left"/>
             </w:pPr>
             <w:r>
               <w:rPr>
@@ -1094,133 +1150,6 @@
                 <w:highlightCs w:val="yellow"/>
               </w:rPr>
               <w:t xml:space="preserve">[CV, diplômes, contrat de sous-traitance]</w:t>
-            </w:r>
-          </w:p>
-        </w:tc>
-      </w:tr>
-      <w:tr>
-        <w:trPr>
-          <w:cantSplit/>
-        </w:trPr>
-        <w:tc>
-          <w:tcPr>
-            <w:tcW w:type="dxa" w:w="1700"/>
-            <w:tcMar>
-              <w:top w:type="dxa" w:w="60"/>
-              <w:left w:type="dxa" w:w="90"/>
-              <w:bottom w:type="dxa" w:w="60"/>
-              <w:right w:type="dxa" w:w="90"/>
-            </w:tcMar>
-          </w:tcPr>
-          <w:p>
-            <w:pPr>
-              <w:spacing w:after="40"/>
-            </w:pPr>
-            <w:r>
-              <w:rPr>
-                <w:rFonts w:ascii="Inter" w:cs="Inter" w:eastAsia="Inter" w:hAnsi="Inter"/>
-                <w:b/>
-                <w:bCs/>
-                <w:highlight w:val="yellow"/>
-                <w:highlightCs w:val="yellow"/>
-              </w:rPr>
-              <w:t xml:space="preserve">[Intervenant expert no-code à identifier]</w:t>
-            </w:r>
-          </w:p>
-        </w:tc>
-        <w:tc>
-          <w:tcPr>
-            <w:tcW w:type="dxa" w:w="1500"/>
-            <w:tcMar>
-              <w:top w:type="dxa" w:w="60"/>
-              <w:left w:type="dxa" w:w="90"/>
-              <w:bottom w:type="dxa" w:w="60"/>
-              <w:right w:type="dxa" w:w="90"/>
-            </w:tcMar>
-          </w:tcPr>
-          <w:p>
-            <w:pPr>
-              <w:spacing w:after="40"/>
-            </w:pPr>
-            <w:r>
-              <w:rPr>
-                <w:rFonts w:ascii="Inter" w:cs="Inter" w:eastAsia="Inter" w:hAnsi="Inter"/>
-              </w:rPr>
-              <w:t xml:space="preserve">Sous-traitant (à contractualiser)</w:t>
-            </w:r>
-          </w:p>
-        </w:tc>
-        <w:tc>
-          <w:tcPr>
-            <w:tcW w:type="dxa" w:w="3200"/>
-            <w:tcMar>
-              <w:top w:type="dxa" w:w="60"/>
-              <w:left w:type="dxa" w:w="90"/>
-              <w:bottom w:type="dxa" w:w="60"/>
-              <w:right w:type="dxa" w:w="90"/>
-            </w:tcMar>
-          </w:tcPr>
-          <w:p>
-            <w:pPr>
-              <w:spacing w:after="40"/>
-            </w:pPr>
-            <w:r>
-              <w:rPr>
-                <w:rFonts w:ascii="Inter" w:cs="Inter" w:eastAsia="Inter" w:hAnsi="Inter"/>
-                <w:b/>
-                <w:bCs/>
-                <w:highlight w:val="yellow"/>
-                <w:highlightCs w:val="yellow"/>
-              </w:rPr>
-              <w:t xml:space="preserve">[Expérience de développement d’applications sans code]</w:t>
-            </w:r>
-          </w:p>
-        </w:tc>
-        <w:tc>
-          <w:tcPr>
-            <w:tcW w:type="dxa" w:w="1800"/>
-            <w:tcMar>
-              <w:top w:type="dxa" w:w="60"/>
-              <w:left w:type="dxa" w:w="90"/>
-              <w:bottom w:type="dxa" w:w="60"/>
-              <w:right w:type="dxa" w:w="90"/>
-            </w:tcMar>
-          </w:tcPr>
-          <w:p>
-            <w:pPr>
-              <w:spacing w:after="40"/>
-            </w:pPr>
-            <w:r>
-              <w:rPr>
-                <w:rFonts w:ascii="Inter" w:cs="Inter" w:eastAsia="Inter" w:hAnsi="Inter"/>
-              </w:rPr>
-              <w:t xml:space="preserve">Product Builder : développement et configuration d’applications</w:t>
-            </w:r>
-          </w:p>
-        </w:tc>
-        <w:tc>
-          <w:tcPr>
-            <w:tcW w:type="dxa" w:w="1438"/>
-            <w:tcMar>
-              <w:top w:type="dxa" w:w="60"/>
-              <w:left w:type="dxa" w:w="90"/>
-              <w:bottom w:type="dxa" w:w="60"/>
-              <w:right w:type="dxa" w:w="90"/>
-            </w:tcMar>
-          </w:tcPr>
-          <w:p>
-            <w:pPr>
-              <w:spacing w:after="40"/>
-            </w:pPr>
-            <w:r>
-              <w:rPr>
-                <w:rFonts w:ascii="Inter" w:cs="Inter" w:eastAsia="Inter" w:hAnsi="Inter"/>
-                <w:b/>
-                <w:bCs/>
-                <w:highlight w:val="yellow"/>
-                <w:highlightCs w:val="yellow"/>
-              </w:rPr>
-              <w:t xml:space="preserve">[CV, attestations, contrat de sous-traitance]</w:t>
             </w:r>
           </w:p>
         </w:tc>
@@ -1252,6 +1181,7 @@
           <w:numId w:val="2"/>
         </w:numPr>
         <w:spacing w:after="60" w:line="276"/>
+        <w:jc w:val="both"/>
       </w:pPr>
       <w:r>
         <w:rPr>
@@ -1271,7 +1201,7 @@
         <w:rPr>
           <w:rFonts w:ascii="Inter" w:cs="Inter" w:eastAsia="Inter" w:hAnsi="Inter"/>
         </w:rPr>
-        <w:t xml:space="preserve"> et/ou d’un diplôme de niveau au moins égal à celui de la certification préparée.</w:t>
+        <w:t xml:space="preserve"> et/ou d’un diplôme de niveau au moins égal à celui du titre préparé.</w:t>
       </w:r>
     </w:p>
     <w:p>
@@ -1282,12 +1212,13 @@
           <w:numId w:val="2"/>
         </w:numPr>
         <w:spacing w:after="60" w:line="276"/>
-      </w:pPr>
-      <w:r>
-        <w:rPr>
-          <w:rFonts w:ascii="Inter" w:cs="Inter" w:eastAsia="Inter" w:hAnsi="Inter"/>
-        </w:rPr>
-        <w:t xml:space="preserve">Pour le titre professionnel MEM, l’équipe respecte les exigences fixées par le référentiel de certification du titre. Pour le Product Builder No-Code et le Responsable RH, elle respecte les exigences fixées par chaque certificateur dans la convention de partenariat.</w:t>
+        <w:jc w:val="both"/>
+      </w:pPr>
+      <w:r>
+        <w:rPr>
+          <w:rFonts w:ascii="Inter" w:cs="Inter" w:eastAsia="Inter" w:hAnsi="Inter"/>
+        </w:rPr>
+        <w:t xml:space="preserve">L’équipe respecte les exigences fixées par le référentiel de certification du titre professionnel MEM et par le règlement des sessions de validation.</w:t>
       </w:r>
     </w:p>
     <w:p>
@@ -1298,12 +1229,13 @@
           <w:numId w:val="2"/>
         </w:numPr>
         <w:spacing w:after="60" w:line="276"/>
-      </w:pPr>
-      <w:r>
-        <w:rPr>
-          <w:rFonts w:ascii="Inter" w:cs="Inter" w:eastAsia="Inter" w:hAnsi="Inter"/>
-        </w:rPr>
-        <w:t xml:space="preserve">YEBA FORMATIONS compte aujourd’hui un formateur permanent, son dirigeant. Les modules qui demandent une expertise technique pointue (droit du travail et paie, développement sans code) seront confiés à des </w:t>
+        <w:jc w:val="both"/>
+      </w:pPr>
+      <w:r>
+        <w:rPr>
+          <w:rFonts w:ascii="Inter" w:cs="Inter" w:eastAsia="Inter" w:hAnsi="Inter"/>
+        </w:rPr>
+        <w:t xml:space="preserve">YEBA FORMATIONS compte aujourd’hui un formateur permanent, son dirigeant. Pour sécuriser le CCP 3, plus technique sur le plan de la gestion, un </w:t>
       </w:r>
       <w:r>
         <w:rPr>
@@ -1311,13 +1243,13 @@
           <w:b/>
           <w:bCs/>
         </w:rPr>
-        <w:t xml:space="preserve">intervenants experts sous contrat de sous-traitance</w:t>
-      </w:r>
-      <w:r>
-        <w:rPr>
-          <w:rFonts w:ascii="Inter" w:cs="Inter" w:eastAsia="Inter" w:hAnsi="Inter"/>
-        </w:rPr>
-        <w:t xml:space="preserve">, recrutés avant le </w:t>
+        <w:t xml:space="preserve">intervenant expert</w:t>
+      </w:r>
+      <w:r>
+        <w:rPr>
+          <w:rFonts w:ascii="Inter" w:cs="Inter" w:eastAsia="Inter" w:hAnsi="Inter"/>
+        </w:rPr>
+        <w:t xml:space="preserve"> sera recruté par contrat de sous-traitance avant le </w:t>
       </w:r>
       <w:r>
         <w:rPr>
@@ -1331,7 +1263,7 @@
         <w:rPr>
           <w:rFonts w:ascii="Inter" w:cs="Inter" w:eastAsia="Inter" w:hAnsi="Inter"/>
         </w:rPr>
-        <w:t xml:space="preserve">. Leur CV et leurs diplômes seront transmis à la DEETS dès la signature des contrats.</w:t>
+        <w:t xml:space="preserve"> ; son CV et ses diplômes seront transmis à la DEETS dès la signature du contrat.</w:t>
       </w:r>
     </w:p>
     <w:p>
@@ -1342,6 +1274,7 @@
           <w:numId w:val="2"/>
         </w:numPr>
         <w:spacing w:after="60" w:line="276"/>
+        <w:jc w:val="both"/>
       </w:pPr>
       <w:r>
         <w:rPr>
@@ -1372,6 +1305,7 @@
           <w:numId w:val="2"/>
         </w:numPr>
         <w:spacing w:after="60" w:line="276"/>
+        <w:jc w:val="both"/>
       </w:pPr>
       <w:r>
         <w:rPr>
@@ -1438,6 +1372,7 @@
           <w:p>
             <w:pPr>
               <w:spacing w:after="50"/>
+              <w:jc w:val="both"/>
             </w:pPr>
             <w:r>
               <w:rPr>
@@ -1451,7 +1386,7 @@
               <w:rPr>
                 <w:rFonts w:ascii="Inter" w:cs="Inter" w:eastAsia="Inter" w:hAnsi="Inter"/>
               </w:rPr>
-              <w:t xml:space="preserve"> — Les CV et diplômes des formateurs sont des données personnelles : ils ne sont transmis à la DEETS qu’aux fins de l’instruction, avec information préalable des intéressés. Conservation limitée à la durée de la collaboration augmentée des délais de contrôle (</w:t>
+              <w:t xml:space="preserve"> — Les CV et diplômes des formateurs sont des données personnelles : ils ne sont transmis à la DEETS qu’aux fins de l’instruction, avec information préalable des intéressés. Conservation limitée à la durée de la collaboration, augmentée des délais de contrôle (</w:t>
             </w:r>
             <w:r>
               <w:rPr>

</xml_diff>